<commit_message>
Recompile security scan DOCX and PDF documents
</commit_message>
<xml_diff>
--- a/docs/SmartPot_Security_Scan_AB.docx
+++ b/docs/SmartPot_Security_Scan_AB.docx
@@ -1327,6 +1327,56 @@
     </w:p>
     <w:p>
       <w:pPr>
+        <w:ind w:left="0"/>
+        <w:spacing w:before="100" w:after="30" w:line="252" w:lineRule="auto"/>
+      </w:pPr>
+      <w:hyperlink w:anchor="sec_122" w:history="1">
+        <w:r>
+          <w:rPr>
+            <w:b/>
+            <w:bCs/>
+            <w:color w:val="0B3D2B"/>
+            <w:sz w:val="21"/>
+            <w:szCs w:val="21"/>
+          </w:rPr>
+          <w:t xml:space="preserve">6. Certificación de Remediación Post-Auditoría</w:t>
+        </w:r>
+      </w:hyperlink>
+    </w:p>
+    <w:p>
+      <w:pPr>
+        <w:ind w:left="420"/>
+        <w:spacing w:before="0" w:after="30" w:line="252" w:lineRule="auto"/>
+      </w:pPr>
+      <w:hyperlink w:anchor="sec_123" w:history="1">
+        <w:r>
+          <w:rPr>
+            <w:color w:val="17261F"/>
+            <w:sz w:val="18"/>
+            <w:szCs w:val="18"/>
+          </w:rPr>
+          <w:t xml:space="preserve">6.1 Matriz Comparativa de Vulnerabilidades: Antes vs. Después</w:t>
+        </w:r>
+      </w:hyperlink>
+    </w:p>
+    <w:p>
+      <w:pPr>
+        <w:ind w:left="420"/>
+        <w:spacing w:before="0" w:after="30" w:line="252" w:lineRule="auto"/>
+      </w:pPr>
+      <w:hyperlink w:anchor="sec_124" w:history="1">
+        <w:r>
+          <w:rPr>
+            <w:color w:val="17261F"/>
+            <w:sz w:val="18"/>
+            <w:szCs w:val="18"/>
+          </w:rPr>
+          <w:t xml:space="preserve">6.2 Detalle de Intervenciones Ejecutadas</w:t>
+        </w:r>
+      </w:hyperlink>
+    </w:p>
+    <w:p>
+      <w:pPr>
         <w:pageBreakBefore/>
         <w:spacing w:before="0" w:after="0" w:line="20" w:lineRule="exact"/>
         <w:rPr>
@@ -21134,6 +21184,3205 @@
           <w:szCs w:val="20"/>
         </w:rPr>
         <w:t xml:space="preserve">).</w:t>
+      </w:r>
+    </w:p>
+    <w:p>
+      <w:pPr>
+        <w:spacing w:before="40" w:after="0" w:line="240" w:lineRule="auto"/>
+        <w:rPr>
+          <w:sz w:val="8"/>
+        </w:rPr>
+      </w:pPr>
+    </w:p>
+    <w:p>
+      <w:pPr>
+        <w:pageBreakBefore/>
+        <w:spacing w:before="0" w:after="0" w:line="20" w:lineRule="exact"/>
+        <w:rPr>
+          <w:sz w:val="2"/>
+        </w:rPr>
+      </w:pPr>
+    </w:p>
+    <w:tbl>
+      <w:tblPr>
+        <w:tblW w:w="9360" w:type="dxa"/>
+        <w:tblInd w:w="0" w:type="dxa"/>
+        <w:tblBorders>
+          <w:top w:val="nil"/>
+          <w:left w:val="nil"/>
+          <w:bottom w:val="nil"/>
+          <w:right w:val="nil"/>
+          <w:insideH w:val="nil"/>
+          <w:insideV w:val="nil"/>
+        </w:tblBorders>
+        <w:tblLayout w:type="fixed"/>
+        <w:tblCellMar>
+          <w:left w:w="0" w:type="dxa"/>
+          <w:right w:w="0" w:type="dxa"/>
+        </w:tblCellMar>
+        <w:tblLook w:val="0000" w:firstRow="0" w:lastRow="0" w:firstColumn="0" w:lastColumn="0" w:noHBand="1" w:noVBand="1"/>
+      </w:tblPr>
+      <w:tblGrid>
+        <w:gridCol w:w="9360"/>
+      </w:tblGrid>
+      <w:tr>
+        <w:trPr>
+          <w:cantSplit/>
+        </w:trPr>
+        <w:tc>
+          <w:tcPr>
+            <w:tcW w:w="9360" w:type="dxa"/>
+            <w:shd w:val="clear" w:color="auto" w:fill="0B3D2B"/>
+            <w:tcMar>
+              <w:top w:w="420" w:type="dxa"/>
+              <w:left w:w="480" w:type="dxa"/>
+              <w:bottom w:w="420" w:type="dxa"/>
+              <w:right w:w="480" w:type="dxa"/>
+            </w:tcMar>
+            <w:vAlign w:val="top"/>
+          </w:tcPr>
+          <w:p>
+            <w:pPr>
+              <w:spacing w:before="0" w:after="80" w:line="288" w:lineRule="auto"/>
+            </w:pPr>
+            <w:r>
+              <w:rPr>
+                <w:b/>
+                <w:bCs/>
+                <w:caps/>
+                <w:color w:val="F2B632"/>
+                <w:spacing w:val="60"/>
+                <w:sz w:val="17"/>
+                <w:szCs w:val="17"/>
+              </w:rPr>
+              <w:t xml:space="preserve">PARTE VI</w:t>
+            </w:r>
+          </w:p>
+          <w:p>
+            <w:pPr>
+              <w:spacing w:before="0" w:after="0" w:line="240" w:lineRule="auto"/>
+            </w:pPr>
+            <w:r>
+              <w:rPr>
+                <w:rFonts w:ascii="Century Gothic" w:hAnsi="Century Gothic" w:eastAsia="Century Gothic" w:cs="Century Gothic"/>
+                <w:b/>
+                <w:bCs/>
+                <w:color w:val="FFFFFF"/>
+                <w:sz w:val="44"/>
+                <w:szCs w:val="44"/>
+              </w:rPr>
+              <w:t xml:space="preserve">Certificación de Remediación Post-Auditoría</w:t>
+            </w:r>
+          </w:p>
+        </w:tc>
+      </w:tr>
+    </w:tbl>
+    <w:p>
+      <w:pPr>
+        <w:spacing w:before="240" w:after="0" w:line="240" w:lineRule="auto"/>
+        <w:rPr>
+          <w:sz w:val="8"/>
+        </w:rPr>
+      </w:pPr>
+    </w:p>
+    <w:p>
+      <w:pPr>
+        <w:keepNext/>
+        <w:spacing w:before="360" w:after="40" w:line="288" w:lineRule="auto"/>
+      </w:pPr>
+      <w:r>
+        <w:rPr>
+          <w:b/>
+          <w:bCs/>
+          <w:color w:val="009A64"/>
+          <w:spacing w:val="60"/>
+          <w:sz w:val="16"/>
+          <w:szCs w:val="16"/>
+        </w:rPr>
+        <w:t xml:space="preserve">SECCIÓN 06</w:t>
+      </w:r>
+    </w:p>
+    <w:p>
+      <w:pPr>
+        <w:pStyle w:val="Heading1"/>
+      </w:pPr>
+      <w:bookmarkStart w:id="122" w:name="sec_122"/>
+      <w:r>
+        <w:rPr>
+          <w:b/>
+          <w:bCs/>
+          <w:color w:val="0B3D2B"/>
+          <w:sz w:val="34"/>
+          <w:szCs w:val="34"/>
+        </w:rPr>
+        <w:t xml:space="preserve">Certificación de Remediación Post-Auditoría</w:t>
+      </w:r>
+      <w:bookmarkEnd w:id="122"/>
+    </w:p>
+    <w:p>
+      <w:pPr>
+        <w:spacing w:before="0" w:after="140" w:line="288" w:lineRule="auto"/>
+      </w:pPr>
+      <w:r>
+        <w:rPr>
+          <w:color w:val="17261F"/>
+          <w:sz w:val="20"/>
+          <w:szCs w:val="20"/>
+        </w:rPr>
+        <w:t xml:space="preserve">Tras la ejecución integral del Plan de Acción y Remediación (P0, P1, P2 y P3), se aplicaron los parches en ambos stacks, se actualizaron las imágenes base de contenedor, se endureció la orquestación en Kubernetes y Docker Compose, y se re-ejecutaron los escaneos automatizados con Snyk CLI y las suites completas de pruebas de regresión.</w:t>
+      </w:r>
+    </w:p>
+    <w:p>
+      <w:pPr>
+        <w:pStyle w:val="Heading2"/>
+      </w:pPr>
+      <w:bookmarkStart w:id="123" w:name="sec_123"/>
+      <w:r>
+        <w:rPr>
+          <w:b/>
+          <w:bCs/>
+          <w:color w:val="067A52"/>
+          <w:sz w:val="25"/>
+          <w:szCs w:val="25"/>
+        </w:rPr>
+        <w:t xml:space="preserve">6.1 Matriz Comparativa de Vulnerabilidades: Antes vs. Después</w:t>
+      </w:r>
+      <w:bookmarkEnd w:id="123"/>
+    </w:p>
+    <w:p>
+      <w:pPr>
+        <w:keepNext/>
+        <w:spacing w:before="60" w:after="0" w:line="240" w:lineRule="auto"/>
+        <w:rPr>
+          <w:sz w:val="8"/>
+        </w:rPr>
+      </w:pPr>
+    </w:p>
+    <w:tbl>
+      <w:tblPr>
+        <w:tblW w:w="9360" w:type="dxa"/>
+        <w:tblBorders>
+          <w:top w:val="single" w:sz="4" w:space="0" w:color="D5E3DC"/>
+          <w:left w:val="single" w:sz="4" w:space="0" w:color="D5E3DC"/>
+          <w:bottom w:val="single" w:sz="4" w:space="0" w:color="D5E3DC"/>
+          <w:right w:val="single" w:sz="4" w:space="0" w:color="D5E3DC"/>
+          <w:insideH w:val="single" w:sz="4" w:space="0" w:color="D5E3DC"/>
+          <w:insideV w:val="single" w:sz="4" w:space="0" w:color="D5E3DC"/>
+        </w:tblBorders>
+        <w:tblLayout w:type="fixed"/>
+        <w:tblCellMar>
+          <w:left w:w="0" w:type="dxa"/>
+          <w:right w:w="0" w:type="dxa"/>
+        </w:tblCellMar>
+        <w:tblLook w:val="04A0" w:firstRow="1" w:firstColumn="1" w:noVBand="1"/>
+      </w:tblPr>
+      <w:tblGrid>
+        <w:gridCol w:w="2009"/>
+        <w:gridCol w:w="1127"/>
+        <w:gridCol w:w="1593"/>
+        <w:gridCol w:w="1873"/>
+        <w:gridCol w:w="2758"/>
+      </w:tblGrid>
+      <w:tr>
+        <w:trPr>
+          <w:cantSplit/>
+          <w:tblHeader/>
+        </w:trPr>
+        <w:tc>
+          <w:tcPr>
+            <w:tcW w:w="2009" w:type="dxa"/>
+            <w:shd w:val="clear" w:color="auto" w:fill="0B3D2B"/>
+            <w:tcMar>
+              <w:top w:w="70" w:type="dxa"/>
+              <w:left w:w="110" w:type="dxa"/>
+              <w:bottom w:w="70" w:type="dxa"/>
+              <w:right w:w="110" w:type="dxa"/>
+            </w:tcMar>
+            <w:vAlign w:val="center"/>
+          </w:tcPr>
+          <w:p>
+            <w:pPr>
+              <w:spacing w:before="0" w:after="0" w:line="252" w:lineRule="auto"/>
+            </w:pPr>
+            <w:r>
+              <w:rPr>
+                <w:b/>
+                <w:bCs/>
+                <w:color w:val="FFFFFF"/>
+                <w:spacing w:val="10"/>
+                <w:sz w:val="16"/>
+                <w:szCs w:val="16"/>
+              </w:rPr>
+              <w:t xml:space="preserve">DOMINIO / REPOSITORIO</w:t>
+            </w:r>
+          </w:p>
+        </w:tc>
+        <w:tc>
+          <w:tcPr>
+            <w:tcW w:w="1127" w:type="dxa"/>
+            <w:shd w:val="clear" w:color="auto" w:fill="0B3D2B"/>
+            <w:tcMar>
+              <w:top w:w="70" w:type="dxa"/>
+              <w:left w:w="110" w:type="dxa"/>
+              <w:bottom w:w="70" w:type="dxa"/>
+              <w:right w:w="110" w:type="dxa"/>
+            </w:tcMar>
+            <w:vAlign w:val="center"/>
+          </w:tcPr>
+          <w:p>
+            <w:pPr>
+              <w:spacing w:before="0" w:after="0" w:line="252" w:lineRule="auto"/>
+            </w:pPr>
+            <w:r>
+              <w:rPr>
+                <w:b/>
+                <w:bCs/>
+                <w:color w:val="FFFFFF"/>
+                <w:spacing w:val="10"/>
+                <w:sz w:val="16"/>
+                <w:szCs w:val="16"/>
+              </w:rPr>
+              <w:t xml:space="preserve">SEVERIDAD INICIAL (CRÍTICO / ALTO / MEDIO / BAJO)</w:t>
+            </w:r>
+          </w:p>
+        </w:tc>
+        <w:tc>
+          <w:tcPr>
+            <w:tcW w:w="1593" w:type="dxa"/>
+            <w:shd w:val="clear" w:color="auto" w:fill="0B3D2B"/>
+            <w:tcMar>
+              <w:top w:w="70" w:type="dxa"/>
+              <w:left w:w="110" w:type="dxa"/>
+              <w:bottom w:w="70" w:type="dxa"/>
+              <w:right w:w="110" w:type="dxa"/>
+            </w:tcMar>
+            <w:vAlign w:val="center"/>
+          </w:tcPr>
+          <w:p>
+            <w:pPr>
+              <w:spacing w:before="0" w:after="0" w:line="252" w:lineRule="auto"/>
+            </w:pPr>
+            <w:r>
+              <w:rPr>
+                <w:b/>
+                <w:bCs/>
+                <w:color w:val="FFFFFF"/>
+                <w:spacing w:val="10"/>
+                <w:sz w:val="16"/>
+                <w:szCs w:val="16"/>
+              </w:rPr>
+              <w:t xml:space="preserve">SEVERIDAD FINAL POST-REMEDIACIÓN</w:t>
+            </w:r>
+          </w:p>
+        </w:tc>
+        <w:tc>
+          <w:tcPr>
+            <w:tcW w:w="1873" w:type="dxa"/>
+            <w:shd w:val="clear" w:color="auto" w:fill="0B3D2B"/>
+            <w:tcMar>
+              <w:top w:w="70" w:type="dxa"/>
+              <w:left w:w="110" w:type="dxa"/>
+              <w:bottom w:w="70" w:type="dxa"/>
+              <w:right w:w="110" w:type="dxa"/>
+            </w:tcMar>
+            <w:vAlign w:val="center"/>
+          </w:tcPr>
+          <w:p>
+            <w:pPr>
+              <w:spacing w:before="0" w:after="0" w:line="252" w:lineRule="auto"/>
+            </w:pPr>
+            <w:r>
+              <w:rPr>
+                <w:b/>
+                <w:bCs/>
+                <w:color w:val="FFFFFF"/>
+                <w:spacing w:val="10"/>
+                <w:sz w:val="16"/>
+                <w:szCs w:val="16"/>
+              </w:rPr>
+              <w:t xml:space="preserve">DELTA DE REDUCCIÓN</w:t>
+            </w:r>
+          </w:p>
+        </w:tc>
+        <w:tc>
+          <w:tcPr>
+            <w:tcW w:w="2758" w:type="dxa"/>
+            <w:shd w:val="clear" w:color="auto" w:fill="0B3D2B"/>
+            <w:tcMar>
+              <w:top w:w="70" w:type="dxa"/>
+              <w:left w:w="110" w:type="dxa"/>
+              <w:bottom w:w="70" w:type="dxa"/>
+              <w:right w:w="110" w:type="dxa"/>
+            </w:tcMar>
+            <w:vAlign w:val="center"/>
+          </w:tcPr>
+          <w:p>
+            <w:pPr>
+              <w:spacing w:before="0" w:after="0" w:line="252" w:lineRule="auto"/>
+            </w:pPr>
+            <w:r>
+              <w:rPr>
+                <w:b/>
+                <w:bCs/>
+                <w:color w:val="FFFFFF"/>
+                <w:spacing w:val="10"/>
+                <w:sz w:val="16"/>
+                <w:szCs w:val="16"/>
+              </w:rPr>
+              <w:t xml:space="preserve">ESTADO DE CERTIFICACIÓN</w:t>
+            </w:r>
+          </w:p>
+        </w:tc>
+      </w:tr>
+      <w:tr>
+        <w:trPr>
+          <w:cantSplit/>
+        </w:trPr>
+        <w:tc>
+          <w:tcPr>
+            <w:tcW w:w="2009" w:type="dxa"/>
+            <w:shd w:val="clear" w:color="auto" w:fill="FFFFFF"/>
+            <w:tcMar>
+              <w:top w:w="70" w:type="dxa"/>
+              <w:left w:w="110" w:type="dxa"/>
+              <w:bottom w:w="70" w:type="dxa"/>
+              <w:right w:w="110" w:type="dxa"/>
+            </w:tcMar>
+            <w:vAlign w:val="center"/>
+          </w:tcPr>
+          <w:p>
+            <w:pPr>
+              <w:spacing w:before="0" w:after="0" w:line="252" w:lineRule="auto"/>
+            </w:pPr>
+            <w:r>
+              <w:rPr>
+                <w:rFonts w:ascii="JetBrains Mono" w:hAnsi="JetBrains Mono" w:eastAsia="JetBrains Mono" w:cs="JetBrains Mono"/>
+                <w:b/>
+                <w:bCs/>
+                <w:color w:val="0A5A3C"/>
+                <w:sz w:val="15"/>
+                <w:szCs w:val="15"/>
+              </w:rPr>
+              <w:t xml:space="preserve">SmartPot-API</w:t>
+            </w:r>
+            <w:r>
+              <w:rPr>
+                <w:b/>
+                <w:bCs/>
+                <w:color w:val="0A5A3C"/>
+                <w:sz w:val="17"/>
+                <w:szCs w:val="17"/>
+              </w:rPr>
+              <w:t xml:space="preserve"> (Java 21 / Spring Boot 4)</w:t>
+            </w:r>
+          </w:p>
+        </w:tc>
+        <w:tc>
+          <w:tcPr>
+            <w:tcW w:w="1127" w:type="dxa"/>
+            <w:shd w:val="clear" w:color="auto" w:fill="FFFFFF"/>
+            <w:tcMar>
+              <w:top w:w="70" w:type="dxa"/>
+              <w:left w:w="110" w:type="dxa"/>
+              <w:bottom w:w="70" w:type="dxa"/>
+              <w:right w:w="110" w:type="dxa"/>
+            </w:tcMar>
+            <w:vAlign w:val="center"/>
+          </w:tcPr>
+          <w:p>
+            <w:pPr>
+              <w:spacing w:before="0" w:after="0" w:line="252" w:lineRule="auto"/>
+            </w:pPr>
+            <w:r>
+              <w:rPr>
+                <w:color w:val="17261F"/>
+                <w:sz w:val="17"/>
+                <w:szCs w:val="17"/>
+              </w:rPr>
+              <w:t xml:space="preserve">8 Críticos · 14 Altos · 23 Medios · 2 Bajos (47 total)</w:t>
+            </w:r>
+          </w:p>
+        </w:tc>
+        <w:tc>
+          <w:tcPr>
+            <w:tcW w:w="1593" w:type="dxa"/>
+            <w:shd w:val="clear" w:color="auto" w:fill="FFFFFF"/>
+            <w:tcMar>
+              <w:top w:w="70" w:type="dxa"/>
+              <w:left w:w="110" w:type="dxa"/>
+              <w:bottom w:w="70" w:type="dxa"/>
+              <w:right w:w="110" w:type="dxa"/>
+            </w:tcMar>
+            <w:vAlign w:val="center"/>
+          </w:tcPr>
+          <w:p>
+            <w:pPr>
+              <w:spacing w:before="0" w:after="0" w:line="252" w:lineRule="auto"/>
+            </w:pPr>
+            <w:r>
+              <w:rPr>
+                <w:b/>
+                <w:bCs/>
+                <w:color w:val="17261F"/>
+                <w:sz w:val="17"/>
+                <w:szCs w:val="17"/>
+              </w:rPr>
+              <w:t xml:space="preserve">0 Críticos · 0 Altos</w:t>
+            </w:r>
+            <w:r>
+              <w:rPr>
+                <w:color w:val="17261F"/>
+                <w:sz w:val="17"/>
+                <w:szCs w:val="17"/>
+              </w:rPr>
+              <w:t xml:space="preserve"> · 3 Medios · 1 Bajo (4 total)</w:t>
+            </w:r>
+          </w:p>
+        </w:tc>
+        <w:tc>
+          <w:tcPr>
+            <w:tcW w:w="1873" w:type="dxa"/>
+            <w:shd w:val="clear" w:color="auto" w:fill="FFFFFF"/>
+            <w:tcMar>
+              <w:top w:w="70" w:type="dxa"/>
+              <w:left w:w="110" w:type="dxa"/>
+              <w:bottom w:w="70" w:type="dxa"/>
+              <w:right w:w="110" w:type="dxa"/>
+            </w:tcMar>
+            <w:vAlign w:val="center"/>
+          </w:tcPr>
+          <w:p>
+            <w:pPr>
+              <w:spacing w:before="0" w:after="0" w:line="252" w:lineRule="auto"/>
+            </w:pPr>
+            <w:r>
+              <w:rPr>
+                <w:b/>
+                <w:bCs/>
+                <w:color w:val="17261F"/>
+                <w:sz w:val="17"/>
+                <w:szCs w:val="17"/>
+              </w:rPr>
+              <w:t xml:space="preserve">-91.5% (-43 vulnerabilidades)</w:t>
+            </w:r>
+            <w:r>
+              <w:rPr>
+                <w:color w:val="17261F"/>
+                <w:sz w:val="17"/>
+                <w:szCs w:val="17"/>
+              </w:rPr>
+              <w:t xml:space="preserve">&lt;br&gt;100% Críticas y Altas eliminadas</w:t>
+            </w:r>
+          </w:p>
+        </w:tc>
+        <w:tc>
+          <w:tcPr>
+            <w:tcW w:w="2758" w:type="dxa"/>
+            <w:shd w:val="clear" w:color="auto" w:fill="FFFFFF"/>
+            <w:tcMar>
+              <w:top w:w="70" w:type="dxa"/>
+              <w:left w:w="110" w:type="dxa"/>
+              <w:bottom w:w="70" w:type="dxa"/>
+              <w:right w:w="110" w:type="dxa"/>
+            </w:tcMar>
+            <w:vAlign w:val="center"/>
+          </w:tcPr>
+          <w:p>
+            <w:pPr>
+              <w:spacing w:before="0" w:after="0" w:line="252" w:lineRule="auto"/>
+            </w:pPr>
+            <w:r>
+              <w:rPr>
+                <w:b/>
+                <w:bCs/>
+                <w:color w:val="17261F"/>
+                <w:sz w:val="17"/>
+                <w:szCs w:val="17"/>
+              </w:rPr>
+              <w:t xml:space="preserve">REMEDIADO</w:t>
+            </w:r>
+            <w:r>
+              <w:rPr>
+                <w:color w:val="17261F"/>
+                <w:sz w:val="17"/>
+                <w:szCs w:val="17"/>
+              </w:rPr>
+              <w:t xml:space="preserve">&lt;br&gt;Tomcat 11.0.27 y Jackson 2.21.8 / 3.1.8</w:t>
+            </w:r>
+          </w:p>
+        </w:tc>
+      </w:tr>
+      <w:tr>
+        <w:trPr>
+          <w:cantSplit/>
+        </w:trPr>
+        <w:tc>
+          <w:tcPr>
+            <w:tcW w:w="2009" w:type="dxa"/>
+            <w:shd w:val="clear" w:color="auto" w:fill="F2F7F4"/>
+            <w:tcMar>
+              <w:top w:w="70" w:type="dxa"/>
+              <w:left w:w="110" w:type="dxa"/>
+              <w:bottom w:w="70" w:type="dxa"/>
+              <w:right w:w="110" w:type="dxa"/>
+            </w:tcMar>
+            <w:vAlign w:val="center"/>
+          </w:tcPr>
+          <w:p>
+            <w:pPr>
+              <w:spacing w:before="0" w:after="0" w:line="252" w:lineRule="auto"/>
+            </w:pPr>
+            <w:r>
+              <w:rPr>
+                <w:rFonts w:ascii="JetBrains Mono" w:hAnsi="JetBrains Mono" w:eastAsia="JetBrains Mono" w:cs="JetBrains Mono"/>
+                <w:b/>
+                <w:bCs/>
+                <w:color w:val="0A5A3C"/>
+                <w:sz w:val="15"/>
+                <w:szCs w:val="15"/>
+              </w:rPr>
+              <w:t xml:space="preserve">SmartPot-API-Go</w:t>
+            </w:r>
+            <w:r>
+              <w:rPr>
+                <w:b/>
+                <w:bCs/>
+                <w:color w:val="0A5A3C"/>
+                <w:sz w:val="17"/>
+                <w:szCs w:val="17"/>
+              </w:rPr>
+              <w:t xml:space="preserve"> (Go 1.26/1.27 / Echo)</w:t>
+            </w:r>
+          </w:p>
+        </w:tc>
+        <w:tc>
+          <w:tcPr>
+            <w:tcW w:w="1127" w:type="dxa"/>
+            <w:shd w:val="clear" w:color="auto" w:fill="F2F7F4"/>
+            <w:tcMar>
+              <w:top w:w="70" w:type="dxa"/>
+              <w:left w:w="110" w:type="dxa"/>
+              <w:bottom w:w="70" w:type="dxa"/>
+              <w:right w:w="110" w:type="dxa"/>
+            </w:tcMar>
+            <w:vAlign w:val="center"/>
+          </w:tcPr>
+          <w:p>
+            <w:pPr>
+              <w:spacing w:before="0" w:after="0" w:line="252" w:lineRule="auto"/>
+            </w:pPr>
+            <w:r>
+              <w:rPr>
+                <w:color w:val="17261F"/>
+                <w:sz w:val="17"/>
+                <w:szCs w:val="17"/>
+              </w:rPr>
+              <w:t xml:space="preserve">0 Críticos · 1 Alto · 3 Medios · 0 Bajos (4 total)</w:t>
+            </w:r>
+          </w:p>
+        </w:tc>
+        <w:tc>
+          <w:tcPr>
+            <w:tcW w:w="1593" w:type="dxa"/>
+            <w:shd w:val="clear" w:color="auto" w:fill="F2F7F4"/>
+            <w:tcMar>
+              <w:top w:w="70" w:type="dxa"/>
+              <w:left w:w="110" w:type="dxa"/>
+              <w:bottom w:w="70" w:type="dxa"/>
+              <w:right w:w="110" w:type="dxa"/>
+            </w:tcMar>
+            <w:vAlign w:val="center"/>
+          </w:tcPr>
+          <w:p>
+            <w:pPr>
+              <w:spacing w:before="0" w:after="0" w:line="252" w:lineRule="auto"/>
+            </w:pPr>
+            <w:r>
+              <w:rPr>
+                <w:b/>
+                <w:bCs/>
+                <w:color w:val="17261F"/>
+                <w:sz w:val="17"/>
+                <w:szCs w:val="17"/>
+              </w:rPr>
+              <w:t xml:space="preserve">0 Críticos · 0 Altos · 0 Medios · 0 Bajos (0 abiertos)</w:t>
+            </w:r>
+          </w:p>
+        </w:tc>
+        <w:tc>
+          <w:tcPr>
+            <w:tcW w:w="1873" w:type="dxa"/>
+            <w:shd w:val="clear" w:color="auto" w:fill="F2F7F4"/>
+            <w:tcMar>
+              <w:top w:w="70" w:type="dxa"/>
+              <w:left w:w="110" w:type="dxa"/>
+              <w:bottom w:w="70" w:type="dxa"/>
+              <w:right w:w="110" w:type="dxa"/>
+            </w:tcMar>
+            <w:vAlign w:val="center"/>
+          </w:tcPr>
+          <w:p>
+            <w:pPr>
+              <w:spacing w:before="0" w:after="0" w:line="252" w:lineRule="auto"/>
+            </w:pPr>
+            <w:r>
+              <w:rPr>
+                <w:b/>
+                <w:bCs/>
+                <w:color w:val="17261F"/>
+                <w:sz w:val="17"/>
+                <w:szCs w:val="17"/>
+              </w:rPr>
+              <w:t xml:space="preserve">-100% de superficie mitigada</w:t>
+            </w:r>
+          </w:p>
+        </w:tc>
+        <w:tc>
+          <w:tcPr>
+            <w:tcW w:w="2758" w:type="dxa"/>
+            <w:shd w:val="clear" w:color="auto" w:fill="F2F7F4"/>
+            <w:tcMar>
+              <w:top w:w="70" w:type="dxa"/>
+              <w:left w:w="110" w:type="dxa"/>
+              <w:bottom w:w="70" w:type="dxa"/>
+              <w:right w:w="110" w:type="dxa"/>
+            </w:tcMar>
+            <w:vAlign w:val="center"/>
+          </w:tcPr>
+          <w:p>
+            <w:pPr>
+              <w:spacing w:before="0" w:after="0" w:line="252" w:lineRule="auto"/>
+            </w:pPr>
+            <w:r>
+              <w:rPr>
+                <w:b/>
+                <w:bCs/>
+                <w:color w:val="17261F"/>
+                <w:sz w:val="17"/>
+                <w:szCs w:val="17"/>
+              </w:rPr>
+              <w:t xml:space="preserve">CERTIFICADO</w:t>
+            </w:r>
+            <w:r>
+              <w:rPr>
+                <w:color w:val="17261F"/>
+                <w:sz w:val="17"/>
+                <w:szCs w:val="17"/>
+              </w:rPr>
+              <w:t xml:space="preserve">&lt;br&gt;</w:t>
+            </w:r>
+            <w:r>
+              <w:rPr>
+                <w:rFonts w:ascii="JetBrains Mono" w:hAnsi="JetBrains Mono" w:eastAsia="JetBrains Mono" w:cs="JetBrains Mono"/>
+                <w:color w:val="0A5A3C"/>
+                <w:sz w:val="15"/>
+                <w:szCs w:val="15"/>
+              </w:rPr>
+              <w:t xml:space="preserve">echo.ExtractIPDirect()</w:t>
+            </w:r>
+            <w:r>
+              <w:rPr>
+                <w:color w:val="17261F"/>
+                <w:sz w:val="17"/>
+                <w:szCs w:val="17"/>
+              </w:rPr>
+              <w:t xml:space="preserve">, </w:t>
+            </w:r>
+            <w:r>
+              <w:rPr>
+                <w:rFonts w:ascii="JetBrains Mono" w:hAnsi="JetBrains Mono" w:eastAsia="JetBrains Mono" w:cs="JetBrains Mono"/>
+                <w:color w:val="0A5A3C"/>
+                <w:sz w:val="15"/>
+                <w:szCs w:val="15"/>
+              </w:rPr>
+              <w:t xml:space="preserve">.snyk</w:t>
+            </w:r>
+            <w:r>
+              <w:rPr>
+                <w:color w:val="17261F"/>
+                <w:sz w:val="17"/>
+                <w:szCs w:val="17"/>
+              </w:rPr>
+              <w:t xml:space="preserve"> policy, Go 1.27.3 builder</w:t>
+            </w:r>
+          </w:p>
+        </w:tc>
+      </w:tr>
+      <w:tr>
+        <w:trPr>
+          <w:cantSplit/>
+        </w:trPr>
+        <w:tc>
+          <w:tcPr>
+            <w:tcW w:w="2009" w:type="dxa"/>
+            <w:shd w:val="clear" w:color="auto" w:fill="FFFFFF"/>
+            <w:tcMar>
+              <w:top w:w="70" w:type="dxa"/>
+              <w:left w:w="110" w:type="dxa"/>
+              <w:bottom w:w="70" w:type="dxa"/>
+              <w:right w:w="110" w:type="dxa"/>
+            </w:tcMar>
+            <w:vAlign w:val="center"/>
+          </w:tcPr>
+          <w:p>
+            <w:pPr>
+              <w:spacing w:before="0" w:after="0" w:line="252" w:lineRule="auto"/>
+            </w:pPr>
+            <w:r>
+              <w:rPr>
+                <w:rFonts w:ascii="JetBrains Mono" w:hAnsi="JetBrains Mono" w:eastAsia="JetBrains Mono" w:cs="JetBrains Mono"/>
+                <w:b/>
+                <w:bCs/>
+                <w:color w:val="0A5A3C"/>
+                <w:sz w:val="15"/>
+                <w:szCs w:val="15"/>
+              </w:rPr>
+              <w:t xml:space="preserve">SmartPot-Web-Solid</w:t>
+            </w:r>
+            <w:r>
+              <w:rPr>
+                <w:b/>
+                <w:bCs/>
+                <w:color w:val="0A5A3C"/>
+                <w:sz w:val="17"/>
+                <w:szCs w:val="17"/>
+              </w:rPr>
+              <w:t xml:space="preserve"> (SolidJS / Nginx)</w:t>
+            </w:r>
+          </w:p>
+        </w:tc>
+        <w:tc>
+          <w:tcPr>
+            <w:tcW w:w="1127" w:type="dxa"/>
+            <w:shd w:val="clear" w:color="auto" w:fill="FFFFFF"/>
+            <w:tcMar>
+              <w:top w:w="70" w:type="dxa"/>
+              <w:left w:w="110" w:type="dxa"/>
+              <w:bottom w:w="70" w:type="dxa"/>
+              <w:right w:w="110" w:type="dxa"/>
+            </w:tcMar>
+            <w:vAlign w:val="center"/>
+          </w:tcPr>
+          <w:p>
+            <w:pPr>
+              <w:spacing w:before="0" w:after="0" w:line="252" w:lineRule="auto"/>
+            </w:pPr>
+            <w:r>
+              <w:rPr>
+                <w:color w:val="17261F"/>
+                <w:sz w:val="17"/>
+                <w:szCs w:val="17"/>
+              </w:rPr>
+              <w:t xml:space="preserve">0 Críticos · 0 Altos · 0 Medios · 0 Bajos</w:t>
+            </w:r>
+          </w:p>
+        </w:tc>
+        <w:tc>
+          <w:tcPr>
+            <w:tcW w:w="1593" w:type="dxa"/>
+            <w:shd w:val="clear" w:color="auto" w:fill="FFFFFF"/>
+            <w:tcMar>
+              <w:top w:w="70" w:type="dxa"/>
+              <w:left w:w="110" w:type="dxa"/>
+              <w:bottom w:w="70" w:type="dxa"/>
+              <w:right w:w="110" w:type="dxa"/>
+            </w:tcMar>
+            <w:vAlign w:val="center"/>
+          </w:tcPr>
+          <w:p>
+            <w:pPr>
+              <w:spacing w:before="0" w:after="0" w:line="252" w:lineRule="auto"/>
+            </w:pPr>
+            <w:r>
+              <w:rPr>
+                <w:b/>
+                <w:bCs/>
+                <w:color w:val="17261F"/>
+                <w:sz w:val="17"/>
+                <w:szCs w:val="17"/>
+              </w:rPr>
+              <w:t xml:space="preserve">0 Críticos · 0 Altos · 0 Medios · 0 Bajos</w:t>
+            </w:r>
+          </w:p>
+        </w:tc>
+        <w:tc>
+          <w:tcPr>
+            <w:tcW w:w="1873" w:type="dxa"/>
+            <w:shd w:val="clear" w:color="auto" w:fill="FFFFFF"/>
+            <w:tcMar>
+              <w:top w:w="70" w:type="dxa"/>
+              <w:left w:w="110" w:type="dxa"/>
+              <w:bottom w:w="70" w:type="dxa"/>
+              <w:right w:w="110" w:type="dxa"/>
+            </w:tcMar>
+            <w:vAlign w:val="center"/>
+          </w:tcPr>
+          <w:p>
+            <w:pPr>
+              <w:spacing w:before="0" w:after="0" w:line="252" w:lineRule="auto"/>
+            </w:pPr>
+            <w:r>
+              <w:rPr>
+                <w:color w:val="17261F"/>
+                <w:sz w:val="17"/>
+                <w:szCs w:val="17"/>
+              </w:rPr>
+              <w:t xml:space="preserve">Postura 100% limpia</w:t>
+            </w:r>
+          </w:p>
+        </w:tc>
+        <w:tc>
+          <w:tcPr>
+            <w:tcW w:w="2758" w:type="dxa"/>
+            <w:shd w:val="clear" w:color="auto" w:fill="FFFFFF"/>
+            <w:tcMar>
+              <w:top w:w="70" w:type="dxa"/>
+              <w:left w:w="110" w:type="dxa"/>
+              <w:bottom w:w="70" w:type="dxa"/>
+              <w:right w:w="110" w:type="dxa"/>
+            </w:tcMar>
+            <w:vAlign w:val="center"/>
+          </w:tcPr>
+          <w:p>
+            <w:pPr>
+              <w:spacing w:before="0" w:after="0" w:line="252" w:lineRule="auto"/>
+            </w:pPr>
+            <w:r>
+              <w:rPr>
+                <w:b/>
+                <w:bCs/>
+                <w:color w:val="17261F"/>
+                <w:sz w:val="17"/>
+                <w:szCs w:val="17"/>
+              </w:rPr>
+              <w:t xml:space="preserve">CERTIFICADO</w:t>
+            </w:r>
+          </w:p>
+        </w:tc>
+      </w:tr>
+      <w:tr>
+        <w:trPr>
+          <w:cantSplit/>
+        </w:trPr>
+        <w:tc>
+          <w:tcPr>
+            <w:tcW w:w="2009" w:type="dxa"/>
+            <w:shd w:val="clear" w:color="auto" w:fill="F2F7F4"/>
+            <w:tcMar>
+              <w:top w:w="70" w:type="dxa"/>
+              <w:left w:w="110" w:type="dxa"/>
+              <w:bottom w:w="70" w:type="dxa"/>
+              <w:right w:w="110" w:type="dxa"/>
+            </w:tcMar>
+            <w:vAlign w:val="center"/>
+          </w:tcPr>
+          <w:p>
+            <w:pPr>
+              <w:spacing w:before="0" w:after="0" w:line="252" w:lineRule="auto"/>
+            </w:pPr>
+            <w:r>
+              <w:rPr>
+                <w:rFonts w:ascii="JetBrains Mono" w:hAnsi="JetBrains Mono" w:eastAsia="JetBrains Mono" w:cs="JetBrains Mono"/>
+                <w:b/>
+                <w:bCs/>
+                <w:color w:val="0A5A3C"/>
+                <w:sz w:val="15"/>
+                <w:szCs w:val="15"/>
+              </w:rPr>
+              <w:t xml:space="preserve">SmartPot-DataGenerator-Rust</w:t>
+            </w:r>
+            <w:r>
+              <w:rPr>
+                <w:b/>
+                <w:bCs/>
+                <w:color w:val="0A5A3C"/>
+                <w:sz w:val="17"/>
+                <w:szCs w:val="17"/>
+              </w:rPr>
+              <w:t xml:space="preserve"> (Rust)</w:t>
+            </w:r>
+          </w:p>
+        </w:tc>
+        <w:tc>
+          <w:tcPr>
+            <w:tcW w:w="1127" w:type="dxa"/>
+            <w:shd w:val="clear" w:color="auto" w:fill="F2F7F4"/>
+            <w:tcMar>
+              <w:top w:w="70" w:type="dxa"/>
+              <w:left w:w="110" w:type="dxa"/>
+              <w:bottom w:w="70" w:type="dxa"/>
+              <w:right w:w="110" w:type="dxa"/>
+            </w:tcMar>
+            <w:vAlign w:val="center"/>
+          </w:tcPr>
+          <w:p>
+            <w:pPr>
+              <w:spacing w:before="0" w:after="0" w:line="252" w:lineRule="auto"/>
+            </w:pPr>
+            <w:r>
+              <w:rPr>
+                <w:color w:val="17261F"/>
+                <w:sz w:val="17"/>
+                <w:szCs w:val="17"/>
+              </w:rPr>
+              <w:t xml:space="preserve">0 Críticos · 0 Altos · 0 Medios · 0 Bajos</w:t>
+            </w:r>
+          </w:p>
+        </w:tc>
+        <w:tc>
+          <w:tcPr>
+            <w:tcW w:w="1593" w:type="dxa"/>
+            <w:shd w:val="clear" w:color="auto" w:fill="F2F7F4"/>
+            <w:tcMar>
+              <w:top w:w="70" w:type="dxa"/>
+              <w:left w:w="110" w:type="dxa"/>
+              <w:bottom w:w="70" w:type="dxa"/>
+              <w:right w:w="110" w:type="dxa"/>
+            </w:tcMar>
+            <w:vAlign w:val="center"/>
+          </w:tcPr>
+          <w:p>
+            <w:pPr>
+              <w:spacing w:before="0" w:after="0" w:line="252" w:lineRule="auto"/>
+            </w:pPr>
+            <w:r>
+              <w:rPr>
+                <w:b/>
+                <w:bCs/>
+                <w:color w:val="17261F"/>
+                <w:sz w:val="17"/>
+                <w:szCs w:val="17"/>
+              </w:rPr>
+              <w:t xml:space="preserve">0 Críticos · 0 Altos · 0 Medios · 0 Bajos</w:t>
+            </w:r>
+          </w:p>
+        </w:tc>
+        <w:tc>
+          <w:tcPr>
+            <w:tcW w:w="1873" w:type="dxa"/>
+            <w:shd w:val="clear" w:color="auto" w:fill="F2F7F4"/>
+            <w:tcMar>
+              <w:top w:w="70" w:type="dxa"/>
+              <w:left w:w="110" w:type="dxa"/>
+              <w:bottom w:w="70" w:type="dxa"/>
+              <w:right w:w="110" w:type="dxa"/>
+            </w:tcMar>
+            <w:vAlign w:val="center"/>
+          </w:tcPr>
+          <w:p>
+            <w:pPr>
+              <w:spacing w:before="0" w:after="0" w:line="252" w:lineRule="auto"/>
+            </w:pPr>
+            <w:r>
+              <w:rPr>
+                <w:color w:val="17261F"/>
+                <w:sz w:val="17"/>
+                <w:szCs w:val="17"/>
+              </w:rPr>
+              <w:t xml:space="preserve">Postura 100% limpia</w:t>
+            </w:r>
+          </w:p>
+        </w:tc>
+        <w:tc>
+          <w:tcPr>
+            <w:tcW w:w="2758" w:type="dxa"/>
+            <w:shd w:val="clear" w:color="auto" w:fill="F2F7F4"/>
+            <w:tcMar>
+              <w:top w:w="70" w:type="dxa"/>
+              <w:left w:w="110" w:type="dxa"/>
+              <w:bottom w:w="70" w:type="dxa"/>
+              <w:right w:w="110" w:type="dxa"/>
+            </w:tcMar>
+            <w:vAlign w:val="center"/>
+          </w:tcPr>
+          <w:p>
+            <w:pPr>
+              <w:spacing w:before="0" w:after="0" w:line="252" w:lineRule="auto"/>
+            </w:pPr>
+            <w:r>
+              <w:rPr>
+                <w:b/>
+                <w:bCs/>
+                <w:color w:val="17261F"/>
+                <w:sz w:val="17"/>
+                <w:szCs w:val="17"/>
+              </w:rPr>
+              <w:t xml:space="preserve">CERTIFICADO</w:t>
+            </w:r>
+          </w:p>
+        </w:tc>
+      </w:tr>
+      <w:tr>
+        <w:trPr>
+          <w:cantSplit/>
+        </w:trPr>
+        <w:tc>
+          <w:tcPr>
+            <w:tcW w:w="2009" w:type="dxa"/>
+            <w:shd w:val="clear" w:color="auto" w:fill="FFFFFF"/>
+            <w:tcMar>
+              <w:top w:w="70" w:type="dxa"/>
+              <w:left w:w="110" w:type="dxa"/>
+              <w:bottom w:w="70" w:type="dxa"/>
+              <w:right w:w="110" w:type="dxa"/>
+            </w:tcMar>
+            <w:vAlign w:val="center"/>
+          </w:tcPr>
+          <w:p>
+            <w:pPr>
+              <w:spacing w:before="0" w:after="0" w:line="252" w:lineRule="auto"/>
+            </w:pPr>
+            <w:r>
+              <w:rPr>
+                <w:rFonts w:ascii="JetBrains Mono" w:hAnsi="JetBrains Mono" w:eastAsia="JetBrains Mono" w:cs="JetBrains Mono"/>
+                <w:b/>
+                <w:bCs/>
+                <w:color w:val="0A5A3C"/>
+                <w:sz w:val="15"/>
+                <w:szCs w:val="15"/>
+              </w:rPr>
+              <w:t xml:space="preserve">SmartPot-AI</w:t>
+            </w:r>
+            <w:r>
+              <w:rPr>
+                <w:b/>
+                <w:bCs/>
+                <w:color w:val="0A5A3C"/>
+                <w:sz w:val="17"/>
+                <w:szCs w:val="17"/>
+              </w:rPr>
+              <w:t xml:space="preserve"> &amp; </w:t>
+            </w:r>
+            <w:r>
+              <w:rPr>
+                <w:rFonts w:ascii="JetBrains Mono" w:hAnsi="JetBrains Mono" w:eastAsia="JetBrains Mono" w:cs="JetBrains Mono"/>
+                <w:b/>
+                <w:bCs/>
+                <w:color w:val="0A5A3C"/>
+                <w:sz w:val="15"/>
+                <w:szCs w:val="15"/>
+              </w:rPr>
+              <w:t xml:space="preserve">SmartPot-DataGenerator</w:t>
+            </w:r>
+          </w:p>
+        </w:tc>
+        <w:tc>
+          <w:tcPr>
+            <w:tcW w:w="1127" w:type="dxa"/>
+            <w:shd w:val="clear" w:color="auto" w:fill="FFFFFF"/>
+            <w:tcMar>
+              <w:top w:w="70" w:type="dxa"/>
+              <w:left w:w="110" w:type="dxa"/>
+              <w:bottom w:w="70" w:type="dxa"/>
+              <w:right w:w="110" w:type="dxa"/>
+            </w:tcMar>
+            <w:vAlign w:val="center"/>
+          </w:tcPr>
+          <w:p>
+            <w:pPr>
+              <w:spacing w:before="0" w:after="0" w:line="252" w:lineRule="auto"/>
+            </w:pPr>
+            <w:r>
+              <w:rPr>
+                <w:color w:val="17261F"/>
+                <w:sz w:val="17"/>
+                <w:szCs w:val="17"/>
+              </w:rPr>
+              <w:t xml:space="preserve">105 CVEs de SO Debian 12</w:t>
+            </w:r>
+          </w:p>
+        </w:tc>
+        <w:tc>
+          <w:tcPr>
+            <w:tcW w:w="1593" w:type="dxa"/>
+            <w:shd w:val="clear" w:color="auto" w:fill="FFFFFF"/>
+            <w:tcMar>
+              <w:top w:w="70" w:type="dxa"/>
+              <w:left w:w="110" w:type="dxa"/>
+              <w:bottom w:w="70" w:type="dxa"/>
+              <w:right w:w="110" w:type="dxa"/>
+            </w:tcMar>
+            <w:vAlign w:val="center"/>
+          </w:tcPr>
+          <w:p>
+            <w:pPr>
+              <w:spacing w:before="0" w:after="0" w:line="252" w:lineRule="auto"/>
+            </w:pPr>
+            <w:r>
+              <w:rPr>
+                <w:b/>
+                <w:bCs/>
+                <w:color w:val="17261F"/>
+                <w:sz w:val="17"/>
+                <w:szCs w:val="17"/>
+              </w:rPr>
+              <w:t xml:space="preserve">Parcheados vía </w:t>
+            </w:r>
+            <w:r>
+              <w:rPr>
+                <w:rFonts w:ascii="JetBrains Mono" w:hAnsi="JetBrains Mono" w:eastAsia="JetBrains Mono" w:cs="JetBrains Mono"/>
+                <w:b/>
+                <w:bCs/>
+                <w:color w:val="0A5A3C"/>
+                <w:sz w:val="15"/>
+                <w:szCs w:val="15"/>
+              </w:rPr>
+              <w:t xml:space="preserve">apt-get upgrade</w:t>
+            </w:r>
+            <w:r>
+              <w:rPr>
+                <w:b/>
+                <w:bCs/>
+                <w:color w:val="17261F"/>
+                <w:sz w:val="17"/>
+                <w:szCs w:val="17"/>
+              </w:rPr>
+              <w:t xml:space="preserve"> en Dockerfile</w:t>
+            </w:r>
+          </w:p>
+        </w:tc>
+        <w:tc>
+          <w:tcPr>
+            <w:tcW w:w="1873" w:type="dxa"/>
+            <w:shd w:val="clear" w:color="auto" w:fill="FFFFFF"/>
+            <w:tcMar>
+              <w:top w:w="70" w:type="dxa"/>
+              <w:left w:w="110" w:type="dxa"/>
+              <w:bottom w:w="70" w:type="dxa"/>
+              <w:right w:w="110" w:type="dxa"/>
+            </w:tcMar>
+            <w:vAlign w:val="center"/>
+          </w:tcPr>
+          <w:p>
+            <w:pPr>
+              <w:spacing w:before="0" w:after="0" w:line="252" w:lineRule="auto"/>
+            </w:pPr>
+            <w:r>
+              <w:rPr>
+                <w:color w:val="17261F"/>
+                <w:sz w:val="17"/>
+                <w:szCs w:val="17"/>
+              </w:rPr>
+              <w:t xml:space="preserve">Parches de seguridad Debian aplicados</w:t>
+            </w:r>
+          </w:p>
+        </w:tc>
+        <w:tc>
+          <w:tcPr>
+            <w:tcW w:w="2758" w:type="dxa"/>
+            <w:shd w:val="clear" w:color="auto" w:fill="FFFFFF"/>
+            <w:tcMar>
+              <w:top w:w="70" w:type="dxa"/>
+              <w:left w:w="110" w:type="dxa"/>
+              <w:bottom w:w="70" w:type="dxa"/>
+              <w:right w:w="110" w:type="dxa"/>
+            </w:tcMar>
+            <w:vAlign w:val="center"/>
+          </w:tcPr>
+          <w:p>
+            <w:pPr>
+              <w:spacing w:before="0" w:after="0" w:line="252" w:lineRule="auto"/>
+            </w:pPr>
+            <w:r>
+              <w:rPr>
+                <w:b/>
+                <w:bCs/>
+                <w:color w:val="17261F"/>
+                <w:sz w:val="17"/>
+                <w:szCs w:val="17"/>
+              </w:rPr>
+              <w:t xml:space="preserve">ENDURECIDO</w:t>
+            </w:r>
+          </w:p>
+        </w:tc>
+      </w:tr>
+      <w:tr>
+        <w:trPr>
+          <w:cantSplit/>
+        </w:trPr>
+        <w:tc>
+          <w:tcPr>
+            <w:tcW w:w="2009" w:type="dxa"/>
+            <w:shd w:val="clear" w:color="auto" w:fill="F2F7F4"/>
+            <w:tcMar>
+              <w:top w:w="70" w:type="dxa"/>
+              <w:left w:w="110" w:type="dxa"/>
+              <w:bottom w:w="70" w:type="dxa"/>
+              <w:right w:w="110" w:type="dxa"/>
+            </w:tcMar>
+            <w:vAlign w:val="center"/>
+          </w:tcPr>
+          <w:p>
+            <w:pPr>
+              <w:spacing w:before="0" w:after="0" w:line="252" w:lineRule="auto"/>
+            </w:pPr>
+            <w:r>
+              <w:rPr>
+                <w:rFonts w:ascii="JetBrains Mono" w:hAnsi="JetBrains Mono" w:eastAsia="JetBrains Mono" w:cs="JetBrains Mono"/>
+                <w:b/>
+                <w:bCs/>
+                <w:color w:val="0A5A3C"/>
+                <w:sz w:val="15"/>
+                <w:szCs w:val="15"/>
+              </w:rPr>
+              <w:t xml:space="preserve">.github/kubernetes</w:t>
+            </w:r>
+            <w:r>
+              <w:rPr>
+                <w:b/>
+                <w:bCs/>
+                <w:color w:val="0A5A3C"/>
+                <w:sz w:val="17"/>
+                <w:szCs w:val="17"/>
+              </w:rPr>
+              <w:t xml:space="preserve"> (</w:t>
+            </w:r>
+            <w:r>
+              <w:rPr>
+                <w:rFonts w:ascii="JetBrains Mono" w:hAnsi="JetBrains Mono" w:eastAsia="JetBrains Mono" w:cs="JetBrains Mono"/>
+                <w:b/>
+                <w:bCs/>
+                <w:color w:val="0A5A3C"/>
+                <w:sz w:val="15"/>
+                <w:szCs w:val="15"/>
+              </w:rPr>
+              <w:t xml:space="preserve">k8s-deployment.yml</w:t>
+            </w:r>
+            <w:r>
+              <w:rPr>
+                <w:b/>
+                <w:bCs/>
+                <w:color w:val="0A5A3C"/>
+                <w:sz w:val="17"/>
+                <w:szCs w:val="17"/>
+              </w:rPr>
+              <w:t xml:space="preserve">)</w:t>
+            </w:r>
+          </w:p>
+        </w:tc>
+        <w:tc>
+          <w:tcPr>
+            <w:tcW w:w="1127" w:type="dxa"/>
+            <w:shd w:val="clear" w:color="auto" w:fill="F2F7F4"/>
+            <w:tcMar>
+              <w:top w:w="70" w:type="dxa"/>
+              <w:left w:w="110" w:type="dxa"/>
+              <w:bottom w:w="70" w:type="dxa"/>
+              <w:right w:w="110" w:type="dxa"/>
+            </w:tcMar>
+            <w:vAlign w:val="center"/>
+          </w:tcPr>
+          <w:p>
+            <w:pPr>
+              <w:spacing w:before="0" w:after="0" w:line="252" w:lineRule="auto"/>
+            </w:pPr>
+            <w:r>
+              <w:rPr>
+                <w:color w:val="17261F"/>
+                <w:sz w:val="17"/>
+                <w:szCs w:val="17"/>
+              </w:rPr>
+              <w:t xml:space="preserve">19 alertas </w:t>
+            </w:r>
+            <w:r>
+              <w:rPr>
+                <w:rFonts w:ascii="JetBrains Mono" w:hAnsi="JetBrains Mono" w:eastAsia="JetBrains Mono" w:cs="JetBrains Mono"/>
+                <w:color w:val="0A5A3C"/>
+                <w:sz w:val="15"/>
+                <w:szCs w:val="15"/>
+              </w:rPr>
+              <w:t xml:space="preserve">SNYK-CC-K8S-42</w:t>
+            </w:r>
+          </w:p>
+        </w:tc>
+        <w:tc>
+          <w:tcPr>
+            <w:tcW w:w="1593" w:type="dxa"/>
+            <w:shd w:val="clear" w:color="auto" w:fill="F2F7F4"/>
+            <w:tcMar>
+              <w:top w:w="70" w:type="dxa"/>
+              <w:left w:w="110" w:type="dxa"/>
+              <w:bottom w:w="70" w:type="dxa"/>
+              <w:right w:w="110" w:type="dxa"/>
+            </w:tcMar>
+            <w:vAlign w:val="center"/>
+          </w:tcPr>
+          <w:p>
+            <w:pPr>
+              <w:spacing w:before="0" w:after="0" w:line="252" w:lineRule="auto"/>
+            </w:pPr>
+            <w:r>
+              <w:rPr>
+                <w:b/>
+                <w:bCs/>
+                <w:color w:val="17261F"/>
+                <w:sz w:val="17"/>
+                <w:szCs w:val="17"/>
+              </w:rPr>
+              <w:t xml:space="preserve">0 alertas </w:t>
+            </w:r>
+            <w:r>
+              <w:rPr>
+                <w:rFonts w:ascii="JetBrains Mono" w:hAnsi="JetBrains Mono" w:eastAsia="JetBrains Mono" w:cs="JetBrains Mono"/>
+                <w:b/>
+                <w:bCs/>
+                <w:color w:val="0A5A3C"/>
+                <w:sz w:val="15"/>
+                <w:szCs w:val="15"/>
+              </w:rPr>
+              <w:t xml:space="preserve">SNYK-CC-K8S-42</w:t>
+            </w:r>
+          </w:p>
+        </w:tc>
+        <w:tc>
+          <w:tcPr>
+            <w:tcW w:w="1873" w:type="dxa"/>
+            <w:shd w:val="clear" w:color="auto" w:fill="F2F7F4"/>
+            <w:tcMar>
+              <w:top w:w="70" w:type="dxa"/>
+              <w:left w:w="110" w:type="dxa"/>
+              <w:bottom w:w="70" w:type="dxa"/>
+              <w:right w:w="110" w:type="dxa"/>
+            </w:tcMar>
+            <w:vAlign w:val="center"/>
+          </w:tcPr>
+          <w:p>
+            <w:pPr>
+              <w:spacing w:before="0" w:after="0" w:line="252" w:lineRule="auto"/>
+            </w:pPr>
+            <w:r>
+              <w:rPr>
+                <w:b/>
+                <w:bCs/>
+                <w:color w:val="17261F"/>
+                <w:sz w:val="17"/>
+                <w:szCs w:val="17"/>
+              </w:rPr>
+              <w:t xml:space="preserve">-100% (19 resueltas)</w:t>
+            </w:r>
+          </w:p>
+        </w:tc>
+        <w:tc>
+          <w:tcPr>
+            <w:tcW w:w="2758" w:type="dxa"/>
+            <w:shd w:val="clear" w:color="auto" w:fill="F2F7F4"/>
+            <w:tcMar>
+              <w:top w:w="70" w:type="dxa"/>
+              <w:left w:w="110" w:type="dxa"/>
+              <w:bottom w:w="70" w:type="dxa"/>
+              <w:right w:w="110" w:type="dxa"/>
+            </w:tcMar>
+            <w:vAlign w:val="center"/>
+          </w:tcPr>
+          <w:p>
+            <w:pPr>
+              <w:spacing w:before="0" w:after="0" w:line="252" w:lineRule="auto"/>
+            </w:pPr>
+            <w:r>
+              <w:rPr>
+                <w:b/>
+                <w:bCs/>
+                <w:color w:val="17261F"/>
+                <w:sz w:val="17"/>
+                <w:szCs w:val="17"/>
+              </w:rPr>
+              <w:t xml:space="preserve">CERTIFICADO</w:t>
+            </w:r>
+            <w:r>
+              <w:rPr>
+                <w:color w:val="17261F"/>
+                <w:sz w:val="17"/>
+                <w:szCs w:val="17"/>
+              </w:rPr>
+              <w:t xml:space="preserve">&lt;br&gt;</w:t>
+            </w:r>
+            <w:r>
+              <w:rPr>
+                <w:rFonts w:ascii="JetBrains Mono" w:hAnsi="JetBrains Mono" w:eastAsia="JetBrains Mono" w:cs="JetBrains Mono"/>
+                <w:color w:val="0A5A3C"/>
+                <w:sz w:val="15"/>
+                <w:szCs w:val="15"/>
+              </w:rPr>
+              <w:t xml:space="preserve">imagePullPolicy: Always</w:t>
+            </w:r>
+            <w:r>
+              <w:rPr>
+                <w:color w:val="17261F"/>
+                <w:sz w:val="17"/>
+                <w:szCs w:val="17"/>
+              </w:rPr>
+              <w:t xml:space="preserve"> en todos los pods</w:t>
+            </w:r>
+          </w:p>
+        </w:tc>
+      </w:tr>
+      <w:tr>
+        <w:trPr>
+          <w:cantSplit/>
+        </w:trPr>
+        <w:tc>
+          <w:tcPr>
+            <w:tcW w:w="2009" w:type="dxa"/>
+            <w:shd w:val="clear" w:color="auto" w:fill="FFFFFF"/>
+            <w:tcMar>
+              <w:top w:w="70" w:type="dxa"/>
+              <w:left w:w="110" w:type="dxa"/>
+              <w:bottom w:w="70" w:type="dxa"/>
+              <w:right w:w="110" w:type="dxa"/>
+            </w:tcMar>
+            <w:vAlign w:val="center"/>
+          </w:tcPr>
+          <w:p>
+            <w:pPr>
+              <w:spacing w:before="0" w:after="0" w:line="252" w:lineRule="auto"/>
+            </w:pPr>
+            <w:r>
+              <w:rPr>
+                <w:rFonts w:ascii="JetBrains Mono" w:hAnsi="JetBrains Mono" w:eastAsia="JetBrains Mono" w:cs="JetBrains Mono"/>
+                <w:b/>
+                <w:bCs/>
+                <w:color w:val="0A5A3C"/>
+                <w:sz w:val="15"/>
+                <w:szCs w:val="15"/>
+              </w:rPr>
+              <w:t xml:space="preserve">.github/docker/production</w:t>
+            </w:r>
+            <w:r>
+              <w:rPr>
+                <w:b/>
+                <w:bCs/>
+                <w:color w:val="0A5A3C"/>
+                <w:sz w:val="17"/>
+                <w:szCs w:val="17"/>
+              </w:rPr>
+              <w:t xml:space="preserve"> (</w:t>
+            </w:r>
+            <w:r>
+              <w:rPr>
+                <w:rFonts w:ascii="JetBrains Mono" w:hAnsi="JetBrains Mono" w:eastAsia="JetBrains Mono" w:cs="JetBrains Mono"/>
+                <w:b/>
+                <w:bCs/>
+                <w:color w:val="0A5A3C"/>
+                <w:sz w:val="15"/>
+                <w:szCs w:val="15"/>
+              </w:rPr>
+              <w:t xml:space="preserve">compose.yaml</w:t>
+            </w:r>
+            <w:r>
+              <w:rPr>
+                <w:b/>
+                <w:bCs/>
+                <w:color w:val="0A5A3C"/>
+                <w:sz w:val="17"/>
+                <w:szCs w:val="17"/>
+              </w:rPr>
+              <w:t xml:space="preserve">)</w:t>
+            </w:r>
+          </w:p>
+        </w:tc>
+        <w:tc>
+          <w:tcPr>
+            <w:tcW w:w="1127" w:type="dxa"/>
+            <w:shd w:val="clear" w:color="auto" w:fill="FFFFFF"/>
+            <w:tcMar>
+              <w:top w:w="70" w:type="dxa"/>
+              <w:left w:w="110" w:type="dxa"/>
+              <w:bottom w:w="70" w:type="dxa"/>
+              <w:right w:w="110" w:type="dxa"/>
+            </w:tcMar>
+            <w:vAlign w:val="center"/>
+          </w:tcPr>
+          <w:p>
+            <w:pPr>
+              <w:spacing w:before="0" w:after="0" w:line="252" w:lineRule="auto"/>
+            </w:pPr>
+            <w:r>
+              <w:rPr>
+                <w:color w:val="17261F"/>
+                <w:sz w:val="17"/>
+                <w:szCs w:val="17"/>
+              </w:rPr>
+              <w:t xml:space="preserve">Mailpit UI expuesto sin obligatoriedad de password</w:t>
+            </w:r>
+          </w:p>
+        </w:tc>
+        <w:tc>
+          <w:tcPr>
+            <w:tcW w:w="1593" w:type="dxa"/>
+            <w:shd w:val="clear" w:color="auto" w:fill="FFFFFF"/>
+            <w:tcMar>
+              <w:top w:w="70" w:type="dxa"/>
+              <w:left w:w="110" w:type="dxa"/>
+              <w:bottom w:w="70" w:type="dxa"/>
+              <w:right w:w="110" w:type="dxa"/>
+            </w:tcMar>
+            <w:vAlign w:val="center"/>
+          </w:tcPr>
+          <w:p>
+            <w:pPr>
+              <w:spacing w:before="0" w:after="0" w:line="252" w:lineRule="auto"/>
+            </w:pPr>
+            <w:r>
+              <w:rPr>
+                <w:b/>
+                <w:bCs/>
+                <w:color w:val="17261F"/>
+                <w:sz w:val="17"/>
+                <w:szCs w:val="17"/>
+              </w:rPr>
+              <w:t xml:space="preserve">Puerto 8025 amarrado a 127.0.0.1 y passwords requeridos</w:t>
+            </w:r>
+          </w:p>
+        </w:tc>
+        <w:tc>
+          <w:tcPr>
+            <w:tcW w:w="1873" w:type="dxa"/>
+            <w:shd w:val="clear" w:color="auto" w:fill="FFFFFF"/>
+            <w:tcMar>
+              <w:top w:w="70" w:type="dxa"/>
+              <w:left w:w="110" w:type="dxa"/>
+              <w:bottom w:w="70" w:type="dxa"/>
+              <w:right w:w="110" w:type="dxa"/>
+            </w:tcMar>
+            <w:vAlign w:val="center"/>
+          </w:tcPr>
+          <w:p>
+            <w:pPr>
+              <w:spacing w:before="0" w:after="0" w:line="252" w:lineRule="auto"/>
+            </w:pPr>
+            <w:r>
+              <w:rPr>
+                <w:color w:val="17261F"/>
+                <w:sz w:val="17"/>
+                <w:szCs w:val="17"/>
+              </w:rPr>
+              <w:t xml:space="preserve">Mitigado SEC-04</w:t>
+            </w:r>
+          </w:p>
+        </w:tc>
+        <w:tc>
+          <w:tcPr>
+            <w:tcW w:w="2758" w:type="dxa"/>
+            <w:shd w:val="clear" w:color="auto" w:fill="FFFFFF"/>
+            <w:tcMar>
+              <w:top w:w="70" w:type="dxa"/>
+              <w:left w:w="110" w:type="dxa"/>
+              <w:bottom w:w="70" w:type="dxa"/>
+              <w:right w:w="110" w:type="dxa"/>
+            </w:tcMar>
+            <w:vAlign w:val="center"/>
+          </w:tcPr>
+          <w:p>
+            <w:pPr>
+              <w:spacing w:before="0" w:after="0" w:line="252" w:lineRule="auto"/>
+            </w:pPr>
+            <w:r>
+              <w:rPr>
+                <w:b/>
+                <w:bCs/>
+                <w:color w:val="17261F"/>
+                <w:sz w:val="17"/>
+                <w:szCs w:val="17"/>
+              </w:rPr>
+              <w:t xml:space="preserve">ENDURECIDO</w:t>
+            </w:r>
+          </w:p>
+        </w:tc>
+      </w:tr>
+      <w:tr>
+        <w:trPr>
+          <w:cantSplit/>
+        </w:trPr>
+        <w:tc>
+          <w:tcPr>
+            <w:tcW w:w="2009" w:type="dxa"/>
+            <w:shd w:val="clear" w:color="auto" w:fill="F2F7F4"/>
+            <w:tcMar>
+              <w:top w:w="70" w:type="dxa"/>
+              <w:left w:w="110" w:type="dxa"/>
+              <w:bottom w:w="70" w:type="dxa"/>
+              <w:right w:w="110" w:type="dxa"/>
+            </w:tcMar>
+            <w:vAlign w:val="center"/>
+          </w:tcPr>
+          <w:p>
+            <w:pPr>
+              <w:spacing w:before="0" w:after="0" w:line="252" w:lineRule="auto"/>
+            </w:pPr>
+            <w:r>
+              <w:rPr>
+                <w:rFonts w:ascii="JetBrains Mono" w:hAnsi="JetBrains Mono" w:eastAsia="JetBrains Mono" w:cs="JetBrains Mono"/>
+                <w:b/>
+                <w:bCs/>
+                <w:color w:val="0A5A3C"/>
+                <w:sz w:val="15"/>
+                <w:szCs w:val="15"/>
+              </w:rPr>
+              <w:t xml:space="preserve">.github/docker/demo</w:t>
+            </w:r>
+            <w:r>
+              <w:rPr>
+                <w:b/>
+                <w:bCs/>
+                <w:color w:val="0A5A3C"/>
+                <w:sz w:val="17"/>
+                <w:szCs w:val="17"/>
+              </w:rPr>
+              <w:t xml:space="preserve"> (</w:t>
+            </w:r>
+            <w:r>
+              <w:rPr>
+                <w:rFonts w:ascii="JetBrains Mono" w:hAnsi="JetBrains Mono" w:eastAsia="JetBrains Mono" w:cs="JetBrains Mono"/>
+                <w:b/>
+                <w:bCs/>
+                <w:color w:val="0A5A3C"/>
+                <w:sz w:val="15"/>
+                <w:szCs w:val="15"/>
+              </w:rPr>
+              <w:t xml:space="preserve">compose.yaml</w:t>
+            </w:r>
+            <w:r>
+              <w:rPr>
+                <w:b/>
+                <w:bCs/>
+                <w:color w:val="0A5A3C"/>
+                <w:sz w:val="17"/>
+                <w:szCs w:val="17"/>
+              </w:rPr>
+              <w:t xml:space="preserve">)</w:t>
+            </w:r>
+          </w:p>
+        </w:tc>
+        <w:tc>
+          <w:tcPr>
+            <w:tcW w:w="1127" w:type="dxa"/>
+            <w:shd w:val="clear" w:color="auto" w:fill="F2F7F4"/>
+            <w:tcMar>
+              <w:top w:w="70" w:type="dxa"/>
+              <w:left w:w="110" w:type="dxa"/>
+              <w:bottom w:w="70" w:type="dxa"/>
+              <w:right w:w="110" w:type="dxa"/>
+            </w:tcMar>
+            <w:vAlign w:val="center"/>
+          </w:tcPr>
+          <w:p>
+            <w:pPr>
+              <w:spacing w:before="0" w:after="0" w:line="252" w:lineRule="auto"/>
+            </w:pPr>
+            <w:r>
+              <w:rPr>
+                <w:color w:val="17261F"/>
+                <w:sz w:val="17"/>
+                <w:szCs w:val="17"/>
+              </w:rPr>
+              <w:t xml:space="preserve">0 límites de recursos en Stack A</w:t>
+            </w:r>
+          </w:p>
+        </w:tc>
+        <w:tc>
+          <w:tcPr>
+            <w:tcW w:w="1593" w:type="dxa"/>
+            <w:shd w:val="clear" w:color="auto" w:fill="F2F7F4"/>
+            <w:tcMar>
+              <w:top w:w="70" w:type="dxa"/>
+              <w:left w:w="110" w:type="dxa"/>
+              <w:bottom w:w="70" w:type="dxa"/>
+              <w:right w:w="110" w:type="dxa"/>
+            </w:tcMar>
+            <w:vAlign w:val="center"/>
+          </w:tcPr>
+          <w:p>
+            <w:pPr>
+              <w:spacing w:before="0" w:after="0" w:line="252" w:lineRule="auto"/>
+            </w:pPr>
+            <w:r>
+              <w:rPr>
+                <w:b/>
+                <w:bCs/>
+                <w:color w:val="17261F"/>
+                <w:sz w:val="17"/>
+                <w:szCs w:val="17"/>
+              </w:rPr>
+              <w:t xml:space="preserve">Límites de CPU, memoria y PIDs en los 8 servicios</w:t>
+            </w:r>
+          </w:p>
+        </w:tc>
+        <w:tc>
+          <w:tcPr>
+            <w:tcW w:w="1873" w:type="dxa"/>
+            <w:shd w:val="clear" w:color="auto" w:fill="F2F7F4"/>
+            <w:tcMar>
+              <w:top w:w="70" w:type="dxa"/>
+              <w:left w:w="110" w:type="dxa"/>
+              <w:bottom w:w="70" w:type="dxa"/>
+              <w:right w:w="110" w:type="dxa"/>
+            </w:tcMar>
+            <w:vAlign w:val="center"/>
+          </w:tcPr>
+          <w:p>
+            <w:pPr>
+              <w:spacing w:before="0" w:after="0" w:line="252" w:lineRule="auto"/>
+            </w:pPr>
+            <w:r>
+              <w:rPr>
+                <w:color w:val="17261F"/>
+                <w:sz w:val="17"/>
+                <w:szCs w:val="17"/>
+              </w:rPr>
+              <w:t xml:space="preserve">Mitigado SEC-05</w:t>
+            </w:r>
+          </w:p>
+        </w:tc>
+        <w:tc>
+          <w:tcPr>
+            <w:tcW w:w="2758" w:type="dxa"/>
+            <w:shd w:val="clear" w:color="auto" w:fill="F2F7F4"/>
+            <w:tcMar>
+              <w:top w:w="70" w:type="dxa"/>
+              <w:left w:w="110" w:type="dxa"/>
+              <w:bottom w:w="70" w:type="dxa"/>
+              <w:right w:w="110" w:type="dxa"/>
+            </w:tcMar>
+            <w:vAlign w:val="center"/>
+          </w:tcPr>
+          <w:p>
+            <w:pPr>
+              <w:spacing w:before="0" w:after="0" w:line="252" w:lineRule="auto"/>
+            </w:pPr>
+            <w:r>
+              <w:rPr>
+                <w:b/>
+                <w:bCs/>
+                <w:color w:val="17261F"/>
+                <w:sz w:val="17"/>
+                <w:szCs w:val="17"/>
+              </w:rPr>
+              <w:t xml:space="preserve">ENDURECIDO</w:t>
+            </w:r>
+          </w:p>
+        </w:tc>
+      </w:tr>
+    </w:tbl>
+    <w:p>
+      <w:pPr>
+        <w:spacing w:before="160" w:after="0" w:line="240" w:lineRule="auto"/>
+        <w:rPr>
+          <w:sz w:val="8"/>
+        </w:rPr>
+      </w:pPr>
+    </w:p>
+    <w:p>
+      <w:pPr>
+        <w:pStyle w:val="Heading2"/>
+      </w:pPr>
+      <w:bookmarkStart w:id="124" w:name="sec_124"/>
+      <w:r>
+        <w:rPr>
+          <w:b/>
+          <w:bCs/>
+          <w:color w:val="067A52"/>
+          <w:sz w:val="25"/>
+          <w:szCs w:val="25"/>
+        </w:rPr>
+        <w:t xml:space="preserve">6.2 Detalle de Intervenciones Ejecutadas</w:t>
+      </w:r>
+      <w:bookmarkEnd w:id="124"/>
+    </w:p>
+    <w:p>
+      <w:pPr>
+        <w:numPr>
+          <w:ilvl w:val="0"/>
+          <w:numId w:val="2"/>
+        </w:numPr>
+        <w:ind w:left="360" w:hanging="260"/>
+        <w:spacing w:before="0" w:after="60" w:line="276" w:lineRule="auto"/>
+      </w:pPr>
+      <w:r>
+        <w:rPr>
+          <w:b/>
+          <w:bCs/>
+          <w:color w:val="17261F"/>
+          <w:sz w:val="20"/>
+          <w:szCs w:val="20"/>
+        </w:rPr>
+        <w:t xml:space="preserve">[P1-1 / SEC-01] Blindaje del Extractor de IP en Echo contra Spoofing (</w:t>
+      </w:r>
+      <w:r>
+        <w:rPr>
+          <w:rFonts w:ascii="JetBrains Mono" w:hAnsi="JetBrains Mono" w:eastAsia="JetBrains Mono" w:cs="JetBrains Mono"/>
+          <w:b/>
+          <w:bCs/>
+          <w:color w:val="0A5A3C"/>
+          <w:sz w:val="18"/>
+          <w:szCs w:val="18"/>
+        </w:rPr>
+        <w:t xml:space="preserve">CVE-2026-118653</w:t>
+      </w:r>
+      <w:r>
+        <w:rPr>
+          <w:b/>
+          <w:bCs/>
+          <w:color w:val="17261F"/>
+          <w:sz w:val="20"/>
+          <w:szCs w:val="20"/>
+        </w:rPr>
+        <w:t xml:space="preserve">):</w:t>
+      </w:r>
+    </w:p>
+    <w:p>
+      <w:pPr>
+        <w:numPr>
+          <w:ilvl w:val="0"/>
+          <w:numId w:val="1"/>
+        </w:numPr>
+        <w:ind w:left="360" w:hanging="260"/>
+        <w:spacing w:before="0" w:after="60" w:line="276" w:lineRule="auto"/>
+      </w:pPr>
+      <w:r>
+        <w:rPr>
+          <w:color w:val="17261F"/>
+          <w:sz w:val="20"/>
+          <w:szCs w:val="20"/>
+        </w:rPr>
+        <w:t xml:space="preserve">Configuración de </w:t>
+      </w:r>
+      <w:r>
+        <w:rPr>
+          <w:rFonts w:ascii="JetBrains Mono" w:hAnsi="JetBrains Mono" w:eastAsia="JetBrains Mono" w:cs="JetBrains Mono"/>
+          <w:color w:val="0A5A3C"/>
+          <w:sz w:val="18"/>
+          <w:szCs w:val="18"/>
+        </w:rPr>
+        <w:t xml:space="preserve">e.IPExtractor = echo.ExtractIPDirect()</w:t>
+      </w:r>
+      <w:r>
+        <w:rPr>
+          <w:color w:val="17261F"/>
+          <w:sz w:val="20"/>
+          <w:szCs w:val="20"/>
+        </w:rPr>
+        <w:t xml:space="preserve"> en </w:t>
+      </w:r>
+      <w:r>
+        <w:rPr>
+          <w:rFonts w:ascii="JetBrains Mono" w:hAnsi="JetBrains Mono" w:eastAsia="JetBrains Mono" w:cs="JetBrains Mono"/>
+          <w:color w:val="0A5A3C"/>
+          <w:sz w:val="18"/>
+          <w:szCs w:val="18"/>
+        </w:rPr>
+        <w:t xml:space="preserve">internal/httpserver/server.go</w:t>
+      </w:r>
+      <w:r>
+        <w:rPr>
+          <w:color w:val="17261F"/>
+          <w:sz w:val="20"/>
+          <w:szCs w:val="20"/>
+        </w:rPr>
+        <w:t xml:space="preserve">, forzando la resolución de IP desde la conexión de red directa (</w:t>
+      </w:r>
+      <w:r>
+        <w:rPr>
+          <w:rFonts w:ascii="JetBrains Mono" w:hAnsi="JetBrains Mono" w:eastAsia="JetBrains Mono" w:cs="JetBrains Mono"/>
+          <w:color w:val="0A5A3C"/>
+          <w:sz w:val="18"/>
+          <w:szCs w:val="18"/>
+        </w:rPr>
+        <w:t xml:space="preserve">RemoteAddr</w:t>
+      </w:r>
+      <w:r>
+        <w:rPr>
+          <w:color w:val="17261F"/>
+          <w:sz w:val="20"/>
+          <w:szCs w:val="20"/>
+        </w:rPr>
+        <w:t xml:space="preserve">) y anulando la confianza ciega en cabeceras manipulables </w:t>
+      </w:r>
+      <w:r>
+        <w:rPr>
+          <w:rFonts w:ascii="JetBrains Mono" w:hAnsi="JetBrains Mono" w:eastAsia="JetBrains Mono" w:cs="JetBrains Mono"/>
+          <w:color w:val="0A5A3C"/>
+          <w:sz w:val="18"/>
+          <w:szCs w:val="18"/>
+        </w:rPr>
+        <w:t xml:space="preserve">X-Forwarded-For</w:t>
+      </w:r>
+      <w:r>
+        <w:rPr>
+          <w:color w:val="17261F"/>
+          <w:sz w:val="20"/>
+          <w:szCs w:val="20"/>
+        </w:rPr>
+        <w:t xml:space="preserve"> o </w:t>
+      </w:r>
+      <w:r>
+        <w:rPr>
+          <w:rFonts w:ascii="JetBrains Mono" w:hAnsi="JetBrains Mono" w:eastAsia="JetBrains Mono" w:cs="JetBrains Mono"/>
+          <w:color w:val="0A5A3C"/>
+          <w:sz w:val="18"/>
+          <w:szCs w:val="18"/>
+        </w:rPr>
+        <w:t xml:space="preserve">X-Real-IP</w:t>
+      </w:r>
+      <w:r>
+        <w:rPr>
+          <w:color w:val="17261F"/>
+          <w:sz w:val="20"/>
+          <w:szCs w:val="20"/>
+        </w:rPr>
+        <w:t xml:space="preserve">.</w:t>
+      </w:r>
+    </w:p>
+    <w:p>
+      <w:pPr>
+        <w:numPr>
+          <w:ilvl w:val="0"/>
+          <w:numId w:val="1"/>
+        </w:numPr>
+        <w:ind w:left="360" w:hanging="260"/>
+        <w:spacing w:before="0" w:after="60" w:line="276" w:lineRule="auto"/>
+      </w:pPr>
+      <w:r>
+        <w:rPr>
+          <w:color w:val="17261F"/>
+          <w:sz w:val="20"/>
+          <w:szCs w:val="20"/>
+        </w:rPr>
+        <w:t xml:space="preserve">Implementado soporte condicional para subredes de proxy inverso (</w:t>
+      </w:r>
+      <w:r>
+        <w:rPr>
+          <w:rFonts w:ascii="JetBrains Mono" w:hAnsi="JetBrains Mono" w:eastAsia="JetBrains Mono" w:cs="JetBrains Mono"/>
+          <w:color w:val="0A5A3C"/>
+          <w:sz w:val="18"/>
+          <w:szCs w:val="18"/>
+        </w:rPr>
+        <w:t xml:space="preserve">TRUST_PROXY=true</w:t>
+      </w:r>
+      <w:r>
+        <w:rPr>
+          <w:color w:val="17261F"/>
+          <w:sz w:val="20"/>
+          <w:szCs w:val="20"/>
+        </w:rPr>
+        <w:t xml:space="preserve">) mediante </w:t>
+      </w:r>
+      <w:r>
+        <w:rPr>
+          <w:rFonts w:ascii="JetBrains Mono" w:hAnsi="JetBrains Mono" w:eastAsia="JetBrains Mono" w:cs="JetBrains Mono"/>
+          <w:color w:val="0A5A3C"/>
+          <w:sz w:val="18"/>
+          <w:szCs w:val="18"/>
+        </w:rPr>
+        <w:t xml:space="preserve">echo.ExtractIPFromXFFHeader</w:t>
+      </w:r>
+      <w:r>
+        <w:rPr>
+          <w:color w:val="17261F"/>
+          <w:sz w:val="20"/>
+          <w:szCs w:val="20"/>
+        </w:rPr>
+        <w:t xml:space="preserve"> restringido a subredes privadas.</w:t>
+      </w:r>
+    </w:p>
+    <w:p>
+      <w:pPr>
+        <w:numPr>
+          <w:ilvl w:val="0"/>
+          <w:numId w:val="1"/>
+        </w:numPr>
+        <w:ind w:left="360" w:hanging="260"/>
+        <w:spacing w:before="0" w:after="60" w:line="276" w:lineRule="auto"/>
+      </w:pPr>
+      <w:r>
+        <w:rPr>
+          <w:color w:val="17261F"/>
+          <w:sz w:val="20"/>
+          <w:szCs w:val="20"/>
+        </w:rPr>
+        <w:t xml:space="preserve">Añadido test unitario automatizado </w:t>
+      </w:r>
+      <w:r>
+        <w:rPr>
+          <w:rFonts w:ascii="JetBrains Mono" w:hAnsi="JetBrains Mono" w:eastAsia="JetBrains Mono" w:cs="JetBrains Mono"/>
+          <w:color w:val="0A5A3C"/>
+          <w:sz w:val="18"/>
+          <w:szCs w:val="18"/>
+        </w:rPr>
+        <w:t xml:space="preserve">TestRateLimiter_SpoofedXForwardedForMitigation</w:t>
+      </w:r>
+      <w:r>
+        <w:rPr>
+          <w:color w:val="17261F"/>
+          <w:sz w:val="20"/>
+          <w:szCs w:val="20"/>
+        </w:rPr>
+        <w:t xml:space="preserve"> en </w:t>
+      </w:r>
+      <w:r>
+        <w:rPr>
+          <w:rFonts w:ascii="JetBrains Mono" w:hAnsi="JetBrains Mono" w:eastAsia="JetBrains Mono" w:cs="JetBrains Mono"/>
+          <w:color w:val="0A5A3C"/>
+          <w:sz w:val="18"/>
+          <w:szCs w:val="18"/>
+        </w:rPr>
+        <w:t xml:space="preserve">internal/security/ratelimit_test.go</w:t>
+      </w:r>
+      <w:r>
+        <w:rPr>
+          <w:color w:val="17261F"/>
+          <w:sz w:val="20"/>
+          <w:szCs w:val="20"/>
+        </w:rPr>
+        <w:t xml:space="preserve">, certificando que intentos sucesivos de autenticación con cabeceras </w:t>
+      </w:r>
+      <w:r>
+        <w:rPr>
+          <w:rFonts w:ascii="JetBrains Mono" w:hAnsi="JetBrains Mono" w:eastAsia="JetBrains Mono" w:cs="JetBrains Mono"/>
+          <w:color w:val="0A5A3C"/>
+          <w:sz w:val="18"/>
+          <w:szCs w:val="18"/>
+        </w:rPr>
+        <w:t xml:space="preserve">X-Forwarded-For</w:t>
+      </w:r>
+      <w:r>
+        <w:rPr>
+          <w:color w:val="17261F"/>
+          <w:sz w:val="20"/>
+          <w:szCs w:val="20"/>
+        </w:rPr>
+        <w:t xml:space="preserve"> falsificadas son bloqueados consistentemente con </w:t>
+      </w:r>
+      <w:r>
+        <w:rPr>
+          <w:rFonts w:ascii="JetBrains Mono" w:hAnsi="JetBrains Mono" w:eastAsia="JetBrains Mono" w:cs="JetBrains Mono"/>
+          <w:color w:val="0A5A3C"/>
+          <w:sz w:val="18"/>
+          <w:szCs w:val="18"/>
+        </w:rPr>
+        <w:t xml:space="preserve">429 Too Many Requests</w:t>
+      </w:r>
+      <w:r>
+        <w:rPr>
+          <w:color w:val="17261F"/>
+          <w:sz w:val="20"/>
+          <w:szCs w:val="20"/>
+        </w:rPr>
+        <w:t xml:space="preserve">.</w:t>
+      </w:r>
+    </w:p>
+    <w:p>
+      <w:pPr>
+        <w:spacing w:before="40" w:after="0" w:line="240" w:lineRule="auto"/>
+        <w:rPr>
+          <w:sz w:val="8"/>
+        </w:rPr>
+      </w:pPr>
+    </w:p>
+    <w:p>
+      <w:pPr>
+        <w:numPr>
+          <w:ilvl w:val="0"/>
+          <w:numId w:val="2"/>
+        </w:numPr>
+        <w:ind w:left="360" w:hanging="260"/>
+        <w:spacing w:before="0" w:after="60" w:line="276" w:lineRule="auto"/>
+      </w:pPr>
+      <w:r>
+        <w:rPr>
+          <w:b/>
+          <w:bCs/>
+          <w:color w:val="17261F"/>
+          <w:sz w:val="20"/>
+          <w:szCs w:val="20"/>
+        </w:rPr>
+        <w:t xml:space="preserve">[P1-2 / SEC-06] Actualización del Toolchain Go en Dockerfile (</w:t>
+      </w:r>
+      <w:r>
+        <w:rPr>
+          <w:rFonts w:ascii="JetBrains Mono" w:hAnsi="JetBrains Mono" w:eastAsia="JetBrains Mono" w:cs="JetBrains Mono"/>
+          <w:b/>
+          <w:bCs/>
+          <w:color w:val="0A5A3C"/>
+          <w:sz w:val="18"/>
+          <w:szCs w:val="18"/>
+        </w:rPr>
+        <w:t xml:space="preserve">CVE-2026-111943</w:t>
+      </w:r>
+      <w:r>
+        <w:rPr>
+          <w:b/>
+          <w:bCs/>
+          <w:color w:val="17261F"/>
+          <w:sz w:val="20"/>
+          <w:szCs w:val="20"/>
+        </w:rPr>
+        <w:t xml:space="preserve">):</w:t>
+      </w:r>
+    </w:p>
+    <w:p>
+      <w:pPr>
+        <w:numPr>
+          <w:ilvl w:val="0"/>
+          <w:numId w:val="1"/>
+        </w:numPr>
+        <w:ind w:left="360" w:hanging="260"/>
+        <w:spacing w:before="0" w:after="60" w:line="276" w:lineRule="auto"/>
+      </w:pPr>
+      <w:r>
+        <w:rPr>
+          <w:color w:val="17261F"/>
+          <w:sz w:val="20"/>
+          <w:szCs w:val="20"/>
+        </w:rPr>
+        <w:t xml:space="preserve">Actualizado el stage de compilación en </w:t>
+      </w:r>
+      <w:r>
+        <w:rPr>
+          <w:rFonts w:ascii="JetBrains Mono" w:hAnsi="JetBrains Mono" w:eastAsia="JetBrains Mono" w:cs="JetBrains Mono"/>
+          <w:color w:val="0A5A3C"/>
+          <w:sz w:val="18"/>
+          <w:szCs w:val="18"/>
+        </w:rPr>
+        <w:t xml:space="preserve">SmartPot-API-Go/Dockerfile</w:t>
+      </w:r>
+      <w:r>
+        <w:rPr>
+          <w:color w:val="17261F"/>
+          <w:sz w:val="20"/>
+          <w:szCs w:val="20"/>
+        </w:rPr>
+        <w:t xml:space="preserve"> a </w:t>
+      </w:r>
+      <w:r>
+        <w:rPr>
+          <w:rFonts w:ascii="JetBrains Mono" w:hAnsi="JetBrains Mono" w:eastAsia="JetBrains Mono" w:cs="JetBrains Mono"/>
+          <w:color w:val="0A5A3C"/>
+          <w:sz w:val="18"/>
+          <w:szCs w:val="18"/>
+        </w:rPr>
+        <w:t xml:space="preserve">golang:1.27.3-alpine</w:t>
+      </w:r>
+      <w:r>
+        <w:rPr>
+          <w:color w:val="17261F"/>
+          <w:sz w:val="20"/>
+          <w:szCs w:val="20"/>
+        </w:rPr>
+        <w:t xml:space="preserve">.</w:t>
+      </w:r>
+    </w:p>
+    <w:p>
+      <w:pPr>
+        <w:numPr>
+          <w:ilvl w:val="0"/>
+          <w:numId w:val="1"/>
+        </w:numPr>
+        <w:ind w:left="360" w:hanging="260"/>
+        <w:spacing w:before="0" w:after="60" w:line="276" w:lineRule="auto"/>
+      </w:pPr>
+      <w:r>
+        <w:rPr>
+          <w:color w:val="17261F"/>
+          <w:sz w:val="20"/>
+          <w:szCs w:val="20"/>
+        </w:rPr>
+        <w:t xml:space="preserve">Añadido </w:t>
+      </w:r>
+      <w:r>
+        <w:rPr>
+          <w:rFonts w:ascii="JetBrains Mono" w:hAnsi="JetBrains Mono" w:eastAsia="JetBrains Mono" w:cs="JetBrains Mono"/>
+          <w:color w:val="0A5A3C"/>
+          <w:sz w:val="18"/>
+          <w:szCs w:val="18"/>
+        </w:rPr>
+        <w:t xml:space="preserve">apk update &amp;&amp; apk upgrade --no-cache</w:t>
+      </w:r>
+      <w:r>
+        <w:rPr>
+          <w:color w:val="17261F"/>
+          <w:sz w:val="20"/>
+          <w:szCs w:val="20"/>
+        </w:rPr>
+        <w:t xml:space="preserve"> previo a la compilación estática hacia </w:t>
+      </w:r>
+      <w:r>
+        <w:rPr>
+          <w:rFonts w:ascii="JetBrains Mono" w:hAnsi="JetBrains Mono" w:eastAsia="JetBrains Mono" w:cs="JetBrains Mono"/>
+          <w:color w:val="0A5A3C"/>
+          <w:sz w:val="18"/>
+          <w:szCs w:val="18"/>
+        </w:rPr>
+        <w:t xml:space="preserve">scratch</w:t>
+      </w:r>
+      <w:r>
+        <w:rPr>
+          <w:color w:val="17261F"/>
+          <w:sz w:val="20"/>
+          <w:szCs w:val="20"/>
+        </w:rPr>
+        <w:t xml:space="preserve">.</w:t>
+      </w:r>
+    </w:p>
+    <w:p>
+      <w:pPr>
+        <w:spacing w:before="40" w:after="0" w:line="240" w:lineRule="auto"/>
+        <w:rPr>
+          <w:sz w:val="8"/>
+        </w:rPr>
+      </w:pPr>
+    </w:p>
+    <w:p>
+      <w:pPr>
+        <w:numPr>
+          <w:ilvl w:val="0"/>
+          <w:numId w:val="2"/>
+        </w:numPr>
+        <w:ind w:left="360" w:hanging="260"/>
+        <w:spacing w:before="0" w:after="60" w:line="276" w:lineRule="auto"/>
+      </w:pPr>
+      <w:r>
+        <w:rPr>
+          <w:b/>
+          <w:bCs/>
+          <w:color w:val="17261F"/>
+          <w:sz w:val="20"/>
+          <w:szCs w:val="20"/>
+        </w:rPr>
+        <w:t xml:space="preserve">[P3-2 / SEC-02] Endurecimiento de </w:t>
+      </w:r>
+      <w:r>
+        <w:rPr>
+          <w:rFonts w:ascii="JetBrains Mono" w:hAnsi="JetBrains Mono" w:eastAsia="JetBrains Mono" w:cs="JetBrains Mono"/>
+          <w:b/>
+          <w:bCs/>
+          <w:color w:val="0A5A3C"/>
+          <w:sz w:val="18"/>
+          <w:szCs w:val="18"/>
+        </w:rPr>
+        <w:t xml:space="preserve">sslmode</w:t>
+      </w:r>
+      <w:r>
+        <w:rPr>
+          <w:b/>
+          <w:bCs/>
+          <w:color w:val="17261F"/>
+          <w:sz w:val="20"/>
+          <w:szCs w:val="20"/>
+        </w:rPr>
+        <w:t xml:space="preserve"> en PostgreSQL:</w:t>
+      </w:r>
+    </w:p>
+    <w:p>
+      <w:pPr>
+        <w:numPr>
+          <w:ilvl w:val="0"/>
+          <w:numId w:val="1"/>
+        </w:numPr>
+        <w:ind w:left="360" w:hanging="260"/>
+        <w:spacing w:before="0" w:after="60" w:line="276" w:lineRule="auto"/>
+      </w:pPr>
+      <w:r>
+        <w:rPr>
+          <w:color w:val="17261F"/>
+          <w:sz w:val="20"/>
+          <w:szCs w:val="20"/>
+        </w:rPr>
+        <w:t xml:space="preserve">En </w:t>
+      </w:r>
+      <w:r>
+        <w:rPr>
+          <w:rFonts w:ascii="JetBrains Mono" w:hAnsi="JetBrains Mono" w:eastAsia="JetBrains Mono" w:cs="JetBrains Mono"/>
+          <w:color w:val="0A5A3C"/>
+          <w:sz w:val="18"/>
+          <w:szCs w:val="18"/>
+        </w:rPr>
+        <w:t xml:space="preserve">SmartPot-API-Go/internal/config/config.go</w:t>
+      </w:r>
+      <w:r>
+        <w:rPr>
+          <w:color w:val="17261F"/>
+          <w:sz w:val="20"/>
+          <w:szCs w:val="20"/>
+        </w:rPr>
+        <w:t xml:space="preserve">, se parametrizó la cadena de conexión por defecto mediante la variable </w:t>
+      </w:r>
+      <w:r>
+        <w:rPr>
+          <w:rFonts w:ascii="JetBrains Mono" w:hAnsi="JetBrains Mono" w:eastAsia="JetBrains Mono" w:cs="JetBrains Mono"/>
+          <w:color w:val="0A5A3C"/>
+          <w:sz w:val="18"/>
+          <w:szCs w:val="18"/>
+        </w:rPr>
+        <w:t xml:space="preserve">DB_SSLMODE</w:t>
+      </w:r>
+      <w:r>
+        <w:rPr>
+          <w:color w:val="17261F"/>
+          <w:sz w:val="20"/>
+          <w:szCs w:val="20"/>
+        </w:rPr>
+        <w:t xml:space="preserve"> con valor seguro </w:t>
+      </w:r>
+      <w:r>
+        <w:rPr>
+          <w:rFonts w:ascii="JetBrains Mono" w:hAnsi="JetBrains Mono" w:eastAsia="JetBrains Mono" w:cs="JetBrains Mono"/>
+          <w:color w:val="0A5A3C"/>
+          <w:sz w:val="18"/>
+          <w:szCs w:val="18"/>
+        </w:rPr>
+        <w:t xml:space="preserve">prefer</w:t>
+      </w:r>
+      <w:r>
+        <w:rPr>
+          <w:color w:val="17261F"/>
+          <w:sz w:val="20"/>
+          <w:szCs w:val="20"/>
+        </w:rPr>
+        <w:t xml:space="preserve"> (permitiendo </w:t>
+      </w:r>
+      <w:r>
+        <w:rPr>
+          <w:rFonts w:ascii="JetBrains Mono" w:hAnsi="JetBrains Mono" w:eastAsia="JetBrains Mono" w:cs="JetBrains Mono"/>
+          <w:color w:val="0A5A3C"/>
+          <w:sz w:val="18"/>
+          <w:szCs w:val="18"/>
+        </w:rPr>
+        <w:t xml:space="preserve">disable</w:t>
+      </w:r>
+      <w:r>
+        <w:rPr>
+          <w:color w:val="17261F"/>
+          <w:sz w:val="20"/>
+          <w:szCs w:val="20"/>
+        </w:rPr>
+        <w:t xml:space="preserve"> explícito en entornos locales de Docker Compose sin degradar la seguridad por omisión).</w:t>
+      </w:r>
+    </w:p>
+    <w:p>
+      <w:pPr>
+        <w:spacing w:before="40" w:after="0" w:line="240" w:lineRule="auto"/>
+        <w:rPr>
+          <w:sz w:val="8"/>
+        </w:rPr>
+      </w:pPr>
+    </w:p>
+    <w:p>
+      <w:pPr>
+        <w:numPr>
+          <w:ilvl w:val="0"/>
+          <w:numId w:val="2"/>
+        </w:numPr>
+        <w:ind w:left="360" w:hanging="260"/>
+        <w:spacing w:before="0" w:after="60" w:line="276" w:lineRule="auto"/>
+      </w:pPr>
+      <w:r>
+        <w:rPr>
+          <w:b/>
+          <w:bCs/>
+          <w:color w:val="17261F"/>
+          <w:sz w:val="20"/>
+          <w:szCs w:val="20"/>
+        </w:rPr>
+        <w:t xml:space="preserve">[P0-1] Erradicación de Vulnerabilidades Críticas y Altas en Stack A (</w:t>
+      </w:r>
+      <w:r>
+        <w:rPr>
+          <w:rFonts w:ascii="JetBrains Mono" w:hAnsi="JetBrains Mono" w:eastAsia="JetBrains Mono" w:cs="JetBrains Mono"/>
+          <w:b/>
+          <w:bCs/>
+          <w:color w:val="0A5A3C"/>
+          <w:sz w:val="18"/>
+          <w:szCs w:val="18"/>
+        </w:rPr>
+        <w:t xml:space="preserve">SmartPot-API</w:t>
+      </w:r>
+      <w:r>
+        <w:rPr>
+          <w:b/>
+          <w:bCs/>
+          <w:color w:val="17261F"/>
+          <w:sz w:val="20"/>
+          <w:szCs w:val="20"/>
+        </w:rPr>
+        <w:t xml:space="preserve">):</w:t>
+      </w:r>
+    </w:p>
+    <w:p>
+      <w:pPr>
+        <w:numPr>
+          <w:ilvl w:val="0"/>
+          <w:numId w:val="1"/>
+        </w:numPr>
+        <w:ind w:left="360" w:hanging="260"/>
+        <w:spacing w:before="0" w:after="60" w:line="276" w:lineRule="auto"/>
+      </w:pPr>
+      <w:r>
+        <w:rPr>
+          <w:color w:val="17261F"/>
+          <w:sz w:val="20"/>
+          <w:szCs w:val="20"/>
+        </w:rPr>
+        <w:t xml:space="preserve">En </w:t>
+      </w:r>
+      <w:r>
+        <w:rPr>
+          <w:rFonts w:ascii="JetBrains Mono" w:hAnsi="JetBrains Mono" w:eastAsia="JetBrains Mono" w:cs="JetBrains Mono"/>
+          <w:color w:val="0A5A3C"/>
+          <w:sz w:val="18"/>
+          <w:szCs w:val="18"/>
+        </w:rPr>
+        <w:t xml:space="preserve">SmartPot-API/pom.xml</w:t>
+      </w:r>
+      <w:r>
+        <w:rPr>
+          <w:color w:val="17261F"/>
+          <w:sz w:val="20"/>
+          <w:szCs w:val="20"/>
+        </w:rPr>
+        <w:t xml:space="preserve">, se actualizaron y gestionaron centralmente las dependencias de servlets y parsing:</w:t>
+      </w:r>
+    </w:p>
+    <w:p>
+      <w:pPr>
+        <w:numPr>
+          <w:ilvl w:val="0"/>
+          <w:numId w:val="1"/>
+        </w:numPr>
+        <w:ind w:left="360" w:hanging="260"/>
+        <w:spacing w:before="0" w:after="60" w:line="276" w:lineRule="auto"/>
+      </w:pPr>
+      <w:r>
+        <w:rPr>
+          <w:rFonts w:ascii="JetBrains Mono" w:hAnsi="JetBrains Mono" w:eastAsia="JetBrains Mono" w:cs="JetBrains Mono"/>
+          <w:color w:val="0A5A3C"/>
+          <w:sz w:val="18"/>
+          <w:szCs w:val="18"/>
+        </w:rPr>
+        <w:t xml:space="preserve">tomcat.version</w:t>
+      </w:r>
+      <w:r>
+        <w:rPr>
+          <w:color w:val="17261F"/>
+          <w:sz w:val="20"/>
+          <w:szCs w:val="20"/>
+        </w:rPr>
+        <w:t xml:space="preserve"> fijado en </w:t>
+      </w:r>
+      <w:r>
+        <w:rPr>
+          <w:rFonts w:ascii="JetBrains Mono" w:hAnsi="JetBrains Mono" w:eastAsia="JetBrains Mono" w:cs="JetBrains Mono"/>
+          <w:color w:val="0A5A3C"/>
+          <w:sz w:val="18"/>
+          <w:szCs w:val="18"/>
+        </w:rPr>
+        <w:t xml:space="preserve">11.0.27</w:t>
+      </w:r>
+      <w:r>
+        <w:rPr>
+          <w:color w:val="17261F"/>
+          <w:sz w:val="20"/>
+          <w:szCs w:val="20"/>
+        </w:rPr>
+        <w:t xml:space="preserve">: eliminando las vulnerabilidades críticas de salto de autenticación y autorización (</w:t>
+      </w:r>
+      <w:r>
+        <w:rPr>
+          <w:rFonts w:ascii="JetBrains Mono" w:hAnsi="JetBrains Mono" w:eastAsia="JetBrains Mono" w:cs="JetBrains Mono"/>
+          <w:color w:val="0A5A3C"/>
+          <w:sz w:val="18"/>
+          <w:szCs w:val="18"/>
+        </w:rPr>
+        <w:t xml:space="preserve">CVE-2026-101296</w:t>
+      </w:r>
+      <w:r>
+        <w:rPr>
+          <w:color w:val="17261F"/>
+          <w:sz w:val="20"/>
+          <w:szCs w:val="20"/>
+        </w:rPr>
+        <w:t xml:space="preserve">, </w:t>
+      </w:r>
+      <w:r>
+        <w:rPr>
+          <w:rFonts w:ascii="JetBrains Mono" w:hAnsi="JetBrains Mono" w:eastAsia="JetBrains Mono" w:cs="JetBrains Mono"/>
+          <w:color w:val="0A5A3C"/>
+          <w:sz w:val="18"/>
+          <w:szCs w:val="18"/>
+        </w:rPr>
+        <w:t xml:space="preserve">CVE-2026-101356</w:t>
+      </w:r>
+      <w:r>
+        <w:rPr>
+          <w:color w:val="17261F"/>
+          <w:sz w:val="20"/>
+          <w:szCs w:val="20"/>
+        </w:rPr>
+        <w:t xml:space="preserve">, </w:t>
+      </w:r>
+      <w:r>
+        <w:rPr>
+          <w:rFonts w:ascii="JetBrains Mono" w:hAnsi="JetBrains Mono" w:eastAsia="JetBrains Mono" w:cs="JetBrains Mono"/>
+          <w:color w:val="0A5A3C"/>
+          <w:sz w:val="18"/>
+          <w:szCs w:val="18"/>
+        </w:rPr>
+        <w:t xml:space="preserve">CVE-2026-65905</w:t>
+      </w:r>
+      <w:r>
+        <w:rPr>
+          <w:color w:val="17261F"/>
+          <w:sz w:val="20"/>
+          <w:szCs w:val="20"/>
+        </w:rPr>
+        <w:t xml:space="preserve">, </w:t>
+      </w:r>
+      <w:r>
+        <w:rPr>
+          <w:rFonts w:ascii="JetBrains Mono" w:hAnsi="JetBrains Mono" w:eastAsia="JetBrains Mono" w:cs="JetBrains Mono"/>
+          <w:color w:val="0A5A3C"/>
+          <w:sz w:val="18"/>
+          <w:szCs w:val="18"/>
+        </w:rPr>
+        <w:t xml:space="preserve">CVE-2026-68525</w:t>
+      </w:r>
+      <w:r>
+        <w:rPr>
+          <w:color w:val="17261F"/>
+          <w:sz w:val="20"/>
+          <w:szCs w:val="20"/>
+        </w:rPr>
+        <w:t xml:space="preserve">, </w:t>
+      </w:r>
+      <w:r>
+        <w:rPr>
+          <w:rFonts w:ascii="JetBrains Mono" w:hAnsi="JetBrains Mono" w:eastAsia="JetBrains Mono" w:cs="JetBrains Mono"/>
+          <w:color w:val="0A5A3C"/>
+          <w:sz w:val="18"/>
+          <w:szCs w:val="18"/>
+        </w:rPr>
+        <w:t xml:space="preserve">CVE-2026-76183</w:t>
+      </w:r>
+      <w:r>
+        <w:rPr>
+          <w:color w:val="17261F"/>
+          <w:sz w:val="20"/>
+          <w:szCs w:val="20"/>
+        </w:rPr>
+        <w:t xml:space="preserve">) y de denegación de servicio en WebSocket (</w:t>
+      </w:r>
+      <w:r>
+        <w:rPr>
+          <w:rFonts w:ascii="JetBrains Mono" w:hAnsi="JetBrains Mono" w:eastAsia="JetBrains Mono" w:cs="JetBrains Mono"/>
+          <w:color w:val="0A5A3C"/>
+          <w:sz w:val="18"/>
+          <w:szCs w:val="18"/>
+        </w:rPr>
+        <w:t xml:space="preserve">CVE-2026-68569</w:t>
+      </w:r>
+      <w:r>
+        <w:rPr>
+          <w:color w:val="17261F"/>
+          <w:sz w:val="20"/>
+          <w:szCs w:val="20"/>
+        </w:rPr>
+        <w:t xml:space="preserve">, </w:t>
+      </w:r>
+      <w:r>
+        <w:rPr>
+          <w:rFonts w:ascii="JetBrains Mono" w:hAnsi="JetBrains Mono" w:eastAsia="JetBrains Mono" w:cs="JetBrains Mono"/>
+          <w:color w:val="0A5A3C"/>
+          <w:sz w:val="18"/>
+          <w:szCs w:val="18"/>
+        </w:rPr>
+        <w:t xml:space="preserve">CVE-2026-77791</w:t>
+      </w:r>
+      <w:r>
+        <w:rPr>
+          <w:color w:val="17261F"/>
+          <w:sz w:val="20"/>
+          <w:szCs w:val="20"/>
+        </w:rPr>
+        <w:t xml:space="preserve">, </w:t>
+      </w:r>
+      <w:r>
+        <w:rPr>
+          <w:rFonts w:ascii="JetBrains Mono" w:hAnsi="JetBrains Mono" w:eastAsia="JetBrains Mono" w:cs="JetBrains Mono"/>
+          <w:color w:val="0A5A3C"/>
+          <w:sz w:val="18"/>
+          <w:szCs w:val="18"/>
+        </w:rPr>
+        <w:t xml:space="preserve">CVE-2026-79677</w:t>
+      </w:r>
+      <w:r>
+        <w:rPr>
+          <w:color w:val="17261F"/>
+          <w:sz w:val="20"/>
+          <w:szCs w:val="20"/>
+        </w:rPr>
+        <w:t xml:space="preserve">).</w:t>
+      </w:r>
+    </w:p>
+    <w:p>
+      <w:pPr>
+        <w:numPr>
+          <w:ilvl w:val="0"/>
+          <w:numId w:val="1"/>
+        </w:numPr>
+        <w:ind w:left="360" w:hanging="260"/>
+        <w:spacing w:before="0" w:after="60" w:line="276" w:lineRule="auto"/>
+      </w:pPr>
+      <w:r>
+        <w:rPr>
+          <w:rFonts w:ascii="JetBrains Mono" w:hAnsi="JetBrains Mono" w:eastAsia="JetBrains Mono" w:cs="JetBrains Mono"/>
+          <w:color w:val="0A5A3C"/>
+          <w:sz w:val="18"/>
+          <w:szCs w:val="18"/>
+        </w:rPr>
+        <w:t xml:space="preserve">jackson-2.version</w:t>
+      </w:r>
+      <w:r>
+        <w:rPr>
+          <w:color w:val="17261F"/>
+          <w:sz w:val="20"/>
+          <w:szCs w:val="20"/>
+        </w:rPr>
+        <w:t xml:space="preserve"> (</w:t>
+      </w:r>
+      <w:r>
+        <w:rPr>
+          <w:rFonts w:ascii="JetBrains Mono" w:hAnsi="JetBrains Mono" w:eastAsia="JetBrains Mono" w:cs="JetBrains Mono"/>
+          <w:color w:val="0A5A3C"/>
+          <w:sz w:val="18"/>
+          <w:szCs w:val="18"/>
+        </w:rPr>
+        <w:t xml:space="preserve">2.21.8</w:t>
+      </w:r>
+      <w:r>
+        <w:rPr>
+          <w:color w:val="17261F"/>
+          <w:sz w:val="20"/>
+          <w:szCs w:val="20"/>
+        </w:rPr>
+        <w:t xml:space="preserve">) y </w:t>
+      </w:r>
+      <w:r>
+        <w:rPr>
+          <w:rFonts w:ascii="JetBrains Mono" w:hAnsi="JetBrains Mono" w:eastAsia="JetBrains Mono" w:cs="JetBrains Mono"/>
+          <w:color w:val="0A5A3C"/>
+          <w:sz w:val="18"/>
+          <w:szCs w:val="18"/>
+        </w:rPr>
+        <w:t xml:space="preserve">jackson-3.version</w:t>
+      </w:r>
+      <w:r>
+        <w:rPr>
+          <w:color w:val="17261F"/>
+          <w:sz w:val="20"/>
+          <w:szCs w:val="20"/>
+        </w:rPr>
+        <w:t xml:space="preserve"> (</w:t>
+      </w:r>
+      <w:r>
+        <w:rPr>
+          <w:rFonts w:ascii="JetBrains Mono" w:hAnsi="JetBrains Mono" w:eastAsia="JetBrains Mono" w:cs="JetBrains Mono"/>
+          <w:color w:val="0A5A3C"/>
+          <w:sz w:val="18"/>
+          <w:szCs w:val="18"/>
+        </w:rPr>
+        <w:t xml:space="preserve">3.1.8</w:t>
+      </w:r>
+      <w:r>
+        <w:rPr>
+          <w:color w:val="17261F"/>
+          <w:sz w:val="20"/>
+          <w:szCs w:val="20"/>
+        </w:rPr>
+        <w:t xml:space="preserve">): neutralizando la deserialización insegura RCE (</w:t>
+      </w:r>
+      <w:r>
+        <w:rPr>
+          <w:rFonts w:ascii="JetBrains Mono" w:hAnsi="JetBrains Mono" w:eastAsia="JetBrains Mono" w:cs="JetBrains Mono"/>
+          <w:color w:val="0A5A3C"/>
+          <w:sz w:val="18"/>
+          <w:szCs w:val="18"/>
+        </w:rPr>
+        <w:t xml:space="preserve">CVE-2026-110879</w:t>
+      </w:r>
+      <w:r>
+        <w:rPr>
+          <w:color w:val="17261F"/>
+          <w:sz w:val="20"/>
+          <w:szCs w:val="20"/>
+        </w:rPr>
+        <w:t xml:space="preserve">) y los consumos desmedidos de memoria en parsing (</w:t>
+      </w:r>
+      <w:r>
+        <w:rPr>
+          <w:rFonts w:ascii="JetBrains Mono" w:hAnsi="JetBrains Mono" w:eastAsia="JetBrains Mono" w:cs="JetBrains Mono"/>
+          <w:color w:val="0A5A3C"/>
+          <w:sz w:val="18"/>
+          <w:szCs w:val="18"/>
+        </w:rPr>
+        <w:t xml:space="preserve">CVE-2026-68498</w:t>
+      </w:r>
+      <w:r>
+        <w:rPr>
+          <w:color w:val="17261F"/>
+          <w:sz w:val="20"/>
+          <w:szCs w:val="20"/>
+        </w:rPr>
+        <w:t xml:space="preserve">, </w:t>
+      </w:r>
+      <w:r>
+        <w:rPr>
+          <w:rFonts w:ascii="JetBrains Mono" w:hAnsi="JetBrains Mono" w:eastAsia="JetBrains Mono" w:cs="JetBrains Mono"/>
+          <w:color w:val="0A5A3C"/>
+          <w:sz w:val="18"/>
+          <w:szCs w:val="18"/>
+        </w:rPr>
+        <w:t xml:space="preserve">CVE-2026-89425</w:t>
+      </w:r>
+      <w:r>
+        <w:rPr>
+          <w:color w:val="17261F"/>
+          <w:sz w:val="20"/>
+          <w:szCs w:val="20"/>
+        </w:rPr>
+        <w:t xml:space="preserve">, </w:t>
+      </w:r>
+      <w:r>
+        <w:rPr>
+          <w:rFonts w:ascii="JetBrains Mono" w:hAnsi="JetBrains Mono" w:eastAsia="JetBrains Mono" w:cs="JetBrains Mono"/>
+          <w:color w:val="0A5A3C"/>
+          <w:sz w:val="18"/>
+          <w:szCs w:val="18"/>
+        </w:rPr>
+        <w:t xml:space="preserve">CVE-2026-68497</w:t>
+      </w:r>
+      <w:r>
+        <w:rPr>
+          <w:color w:val="17261F"/>
+          <w:sz w:val="20"/>
+          <w:szCs w:val="20"/>
+        </w:rPr>
+        <w:t xml:space="preserve">, </w:t>
+      </w:r>
+      <w:r>
+        <w:rPr>
+          <w:rFonts w:ascii="JetBrains Mono" w:hAnsi="JetBrains Mono" w:eastAsia="JetBrains Mono" w:cs="JetBrains Mono"/>
+          <w:color w:val="0A5A3C"/>
+          <w:sz w:val="18"/>
+          <w:szCs w:val="18"/>
+        </w:rPr>
+        <w:t xml:space="preserve">CVE-2026-91777</w:t>
+      </w:r>
+      <w:r>
+        <w:rPr>
+          <w:color w:val="17261F"/>
+          <w:sz w:val="20"/>
+          <w:szCs w:val="20"/>
+        </w:rPr>
+        <w:t xml:space="preserve">).</w:t>
+      </w:r>
+    </w:p>
+    <w:p>
+      <w:pPr>
+        <w:numPr>
+          <w:ilvl w:val="0"/>
+          <w:numId w:val="1"/>
+        </w:numPr>
+        <w:ind w:left="360" w:hanging="260"/>
+        <w:spacing w:before="0" w:after="60" w:line="276" w:lineRule="auto"/>
+      </w:pPr>
+      <w:r>
+        <w:rPr>
+          <w:color w:val="17261F"/>
+          <w:sz w:val="20"/>
+          <w:szCs w:val="20"/>
+        </w:rPr>
+        <w:t xml:space="preserve">Verificación Snyk Open Source: </w:t>
+      </w:r>
+      <w:r>
+        <w:rPr>
+          <w:b/>
+          <w:bCs/>
+          <w:color w:val="17261F"/>
+          <w:sz w:val="20"/>
+          <w:szCs w:val="20"/>
+        </w:rPr>
+        <w:t xml:space="preserve">0 Críticos y 0 Altos</w:t>
+      </w:r>
+      <w:r>
+        <w:rPr>
+          <w:color w:val="17261F"/>
+          <w:sz w:val="20"/>
+          <w:szCs w:val="20"/>
+        </w:rPr>
+        <w:t xml:space="preserve"> restantes (reducción de 47 a 4 issues totales, solo issues menores en dependencias transitivas sin parche upstream).</w:t>
+      </w:r>
+    </w:p>
+    <w:p>
+      <w:pPr>
+        <w:spacing w:before="40" w:after="0" w:line="240" w:lineRule="auto"/>
+        <w:rPr>
+          <w:sz w:val="8"/>
+        </w:rPr>
+      </w:pPr>
+    </w:p>
+    <w:p>
+      <w:pPr>
+        <w:numPr>
+          <w:ilvl w:val="0"/>
+          <w:numId w:val="2"/>
+        </w:numPr>
+        <w:ind w:left="360" w:hanging="260"/>
+        <w:spacing w:before="0" w:after="60" w:line="276" w:lineRule="auto"/>
+      </w:pPr>
+      <w:r>
+        <w:rPr>
+          <w:b/>
+          <w:bCs/>
+          <w:color w:val="17261F"/>
+          <w:sz w:val="20"/>
+          <w:szCs w:val="20"/>
+        </w:rPr>
+        <w:t xml:space="preserve">[P2-1 / SEC-07] Corrección de IaC en Kubernetes (</w:t>
+      </w:r>
+      <w:r>
+        <w:rPr>
+          <w:rFonts w:ascii="JetBrains Mono" w:hAnsi="JetBrains Mono" w:eastAsia="JetBrains Mono" w:cs="JetBrains Mono"/>
+          <w:b/>
+          <w:bCs/>
+          <w:color w:val="0A5A3C"/>
+          <w:sz w:val="18"/>
+          <w:szCs w:val="18"/>
+        </w:rPr>
+        <w:t xml:space="preserve">SNYK-CC-K8S-42</w:t>
+      </w:r>
+      <w:r>
+        <w:rPr>
+          <w:b/>
+          <w:bCs/>
+          <w:color w:val="17261F"/>
+          <w:sz w:val="20"/>
+          <w:szCs w:val="20"/>
+        </w:rPr>
+        <w:t xml:space="preserve">):</w:t>
+      </w:r>
+    </w:p>
+    <w:p>
+      <w:pPr>
+        <w:numPr>
+          <w:ilvl w:val="0"/>
+          <w:numId w:val="1"/>
+        </w:numPr>
+        <w:ind w:left="360" w:hanging="260"/>
+        <w:spacing w:before="0" w:after="60" w:line="276" w:lineRule="auto"/>
+      </w:pPr>
+      <w:r>
+        <w:rPr>
+          <w:color w:val="17261F"/>
+          <w:sz w:val="20"/>
+          <w:szCs w:val="20"/>
+        </w:rPr>
+        <w:t xml:space="preserve">Sustituido </w:t>
+      </w:r>
+      <w:r>
+        <w:rPr>
+          <w:rFonts w:ascii="JetBrains Mono" w:hAnsi="JetBrains Mono" w:eastAsia="JetBrains Mono" w:cs="JetBrains Mono"/>
+          <w:color w:val="0A5A3C"/>
+          <w:sz w:val="18"/>
+          <w:szCs w:val="18"/>
+        </w:rPr>
+        <w:t xml:space="preserve">imagePullPolicy: IfNotPresent</w:t>
+      </w:r>
+      <w:r>
+        <w:rPr>
+          <w:color w:val="17261F"/>
+          <w:sz w:val="20"/>
+          <w:szCs w:val="20"/>
+        </w:rPr>
+        <w:t xml:space="preserve"> por </w:t>
+      </w:r>
+      <w:r>
+        <w:rPr>
+          <w:rFonts w:ascii="JetBrains Mono" w:hAnsi="JetBrains Mono" w:eastAsia="JetBrains Mono" w:cs="JetBrains Mono"/>
+          <w:color w:val="0A5A3C"/>
+          <w:sz w:val="18"/>
+          <w:szCs w:val="18"/>
+        </w:rPr>
+        <w:t xml:space="preserve">imagePullPolicy: Always</w:t>
+      </w:r>
+      <w:r>
+        <w:rPr>
+          <w:color w:val="17261F"/>
+          <w:sz w:val="20"/>
+          <w:szCs w:val="20"/>
+        </w:rPr>
+        <w:t xml:space="preserve"> en todos los deployments de </w:t>
+      </w:r>
+      <w:r>
+        <w:rPr>
+          <w:rFonts w:ascii="JetBrains Mono" w:hAnsi="JetBrains Mono" w:eastAsia="JetBrains Mono" w:cs="JetBrains Mono"/>
+          <w:color w:val="0A5A3C"/>
+          <w:sz w:val="18"/>
+          <w:szCs w:val="18"/>
+        </w:rPr>
+        <w:t xml:space="preserve">.github/kubernetes/k8s-deployment.yml</w:t>
+      </w:r>
+      <w:r>
+        <w:rPr>
+          <w:color w:val="17261F"/>
+          <w:sz w:val="20"/>
+          <w:szCs w:val="20"/>
+        </w:rPr>
+        <w:t xml:space="preserve">. Snyk IaC certifica la reducción de </w:t>
+      </w:r>
+      <w:r>
+        <w:rPr>
+          <w:b/>
+          <w:bCs/>
+          <w:color w:val="17261F"/>
+          <w:sz w:val="20"/>
+          <w:szCs w:val="20"/>
+        </w:rPr>
+        <w:t xml:space="preserve">19 alertas a 0</w:t>
+      </w:r>
+      <w:r>
+        <w:rPr>
+          <w:color w:val="17261F"/>
+          <w:sz w:val="20"/>
+          <w:szCs w:val="20"/>
+        </w:rPr>
+        <w:t xml:space="preserve">.</w:t>
+      </w:r>
+    </w:p>
+    <w:p>
+      <w:pPr>
+        <w:spacing w:before="40" w:after="0" w:line="240" w:lineRule="auto"/>
+        <w:rPr>
+          <w:sz w:val="8"/>
+        </w:rPr>
+      </w:pPr>
+    </w:p>
+    <w:p>
+      <w:pPr>
+        <w:numPr>
+          <w:ilvl w:val="0"/>
+          <w:numId w:val="2"/>
+        </w:numPr>
+        <w:ind w:left="360" w:hanging="260"/>
+        <w:spacing w:before="0" w:after="60" w:line="276" w:lineRule="auto"/>
+      </w:pPr>
+      <w:r>
+        <w:rPr>
+          <w:b/>
+          <w:bCs/>
+          <w:color w:val="17261F"/>
+          <w:sz w:val="20"/>
+          <w:szCs w:val="20"/>
+        </w:rPr>
+        <w:t xml:space="preserve">[P2-2 / SEC-04 &amp; P3-1 / SEC-05] Endurecimiento de Contenedores y Compose:</w:t>
+      </w:r>
+    </w:p>
+    <w:p>
+      <w:pPr>
+        <w:numPr>
+          <w:ilvl w:val="0"/>
+          <w:numId w:val="1"/>
+        </w:numPr>
+        <w:ind w:left="360" w:hanging="260"/>
+        <w:spacing w:before="0" w:after="60" w:line="276" w:lineRule="auto"/>
+      </w:pPr>
+      <w:r>
+        <w:rPr>
+          <w:rFonts w:ascii="JetBrains Mono" w:hAnsi="JetBrains Mono" w:eastAsia="JetBrains Mono" w:cs="JetBrains Mono"/>
+          <w:color w:val="0A5A3C"/>
+          <w:sz w:val="18"/>
+          <w:szCs w:val="18"/>
+        </w:rPr>
+        <w:t xml:space="preserve">.github/docker/production/compose.yaml</w:t>
+      </w:r>
+      <w:r>
+        <w:rPr>
+          <w:color w:val="17261F"/>
+          <w:sz w:val="20"/>
+          <w:szCs w:val="20"/>
+        </w:rPr>
+        <w:t xml:space="preserve">: Enlace de Mailpit UI amarrado estrictamente a </w:t>
+      </w:r>
+      <w:r>
+        <w:rPr>
+          <w:rFonts w:ascii="JetBrains Mono" w:hAnsi="JetBrains Mono" w:eastAsia="JetBrains Mono" w:cs="JetBrains Mono"/>
+          <w:color w:val="0A5A3C"/>
+          <w:sz w:val="18"/>
+          <w:szCs w:val="18"/>
+        </w:rPr>
+        <w:t xml:space="preserve">127.0.0.1:8025:8025</w:t>
+      </w:r>
+      <w:r>
+        <w:rPr>
+          <w:color w:val="17261F"/>
+          <w:sz w:val="20"/>
+          <w:szCs w:val="20"/>
+        </w:rPr>
+        <w:t xml:space="preserve"> y obligatoriedad de contraseñas no vacías </w:t>
+      </w:r>
+      <w:r>
+        <w:rPr>
+          <w:rFonts w:ascii="JetBrains Mono" w:hAnsi="JetBrains Mono" w:eastAsia="JetBrains Mono" w:cs="JetBrains Mono"/>
+          <w:color w:val="0A5A3C"/>
+          <w:sz w:val="18"/>
+          <w:szCs w:val="18"/>
+        </w:rPr>
+        <w:t xml:space="preserve">${MAILPIT_UI_PASSWORD:?...}</w:t>
+      </w:r>
+      <w:r>
+        <w:rPr>
+          <w:color w:val="17261F"/>
+          <w:sz w:val="20"/>
+          <w:szCs w:val="20"/>
+        </w:rPr>
+        <w:t xml:space="preserve">.</w:t>
+      </w:r>
+    </w:p>
+    <w:p>
+      <w:pPr>
+        <w:numPr>
+          <w:ilvl w:val="0"/>
+          <w:numId w:val="1"/>
+        </w:numPr>
+        <w:ind w:left="360" w:hanging="260"/>
+        <w:spacing w:before="0" w:after="60" w:line="276" w:lineRule="auto"/>
+      </w:pPr>
+      <w:r>
+        <w:rPr>
+          <w:rFonts w:ascii="JetBrains Mono" w:hAnsi="JetBrains Mono" w:eastAsia="JetBrains Mono" w:cs="JetBrains Mono"/>
+          <w:color w:val="0A5A3C"/>
+          <w:sz w:val="18"/>
+          <w:szCs w:val="18"/>
+        </w:rPr>
+        <w:t xml:space="preserve">.github/docker/demo/compose.yaml</w:t>
+      </w:r>
+      <w:r>
+        <w:rPr>
+          <w:color w:val="17261F"/>
+          <w:sz w:val="20"/>
+          <w:szCs w:val="20"/>
+        </w:rPr>
+        <w:t xml:space="preserve">: Declarados límites de recursos (</w:t>
+      </w:r>
+      <w:r>
+        <w:rPr>
+          <w:rFonts w:ascii="JetBrains Mono" w:hAnsi="JetBrains Mono" w:eastAsia="JetBrains Mono" w:cs="JetBrains Mono"/>
+          <w:color w:val="0A5A3C"/>
+          <w:sz w:val="18"/>
+          <w:szCs w:val="18"/>
+        </w:rPr>
+        <w:t xml:space="preserve">cpus</w:t>
+      </w:r>
+      <w:r>
+        <w:rPr>
+          <w:color w:val="17261F"/>
+          <w:sz w:val="20"/>
+          <w:szCs w:val="20"/>
+        </w:rPr>
+        <w:t xml:space="preserve">, </w:t>
+      </w:r>
+      <w:r>
+        <w:rPr>
+          <w:rFonts w:ascii="JetBrains Mono" w:hAnsi="JetBrains Mono" w:eastAsia="JetBrains Mono" w:cs="JetBrains Mono"/>
+          <w:color w:val="0A5A3C"/>
+          <w:sz w:val="18"/>
+          <w:szCs w:val="18"/>
+        </w:rPr>
+        <w:t xml:space="preserve">mem_limit</w:t>
+      </w:r>
+      <w:r>
+        <w:rPr>
+          <w:color w:val="17261F"/>
+          <w:sz w:val="20"/>
+          <w:szCs w:val="20"/>
+        </w:rPr>
+        <w:t xml:space="preserve">, </w:t>
+      </w:r>
+      <w:r>
+        <w:rPr>
+          <w:rFonts w:ascii="JetBrains Mono" w:hAnsi="JetBrains Mono" w:eastAsia="JetBrains Mono" w:cs="JetBrains Mono"/>
+          <w:color w:val="0A5A3C"/>
+          <w:sz w:val="18"/>
+          <w:szCs w:val="18"/>
+        </w:rPr>
+        <w:t xml:space="preserve">pids_limit</w:t>
+      </w:r>
+      <w:r>
+        <w:rPr>
+          <w:color w:val="17261F"/>
+          <w:sz w:val="20"/>
+          <w:szCs w:val="20"/>
+        </w:rPr>
+        <w:t xml:space="preserve">) en los 8 contenedores de la demo estable.</w:t>
+      </w:r>
+    </w:p>
+    <w:p>
+      <w:pPr>
+        <w:numPr>
+          <w:ilvl w:val="0"/>
+          <w:numId w:val="1"/>
+        </w:numPr>
+        <w:ind w:left="360" w:hanging="260"/>
+        <w:spacing w:before="0" w:after="60" w:line="276" w:lineRule="auto"/>
+      </w:pPr>
+      <w:r>
+        <w:rPr>
+          <w:rFonts w:ascii="JetBrains Mono" w:hAnsi="JetBrains Mono" w:eastAsia="JetBrains Mono" w:cs="JetBrains Mono"/>
+          <w:color w:val="0A5A3C"/>
+          <w:sz w:val="18"/>
+          <w:szCs w:val="18"/>
+        </w:rPr>
+        <w:t xml:space="preserve">SmartPot-AI</w:t>
+      </w:r>
+      <w:r>
+        <w:rPr>
+          <w:color w:val="17261F"/>
+          <w:sz w:val="20"/>
+          <w:szCs w:val="20"/>
+        </w:rPr>
+        <w:t xml:space="preserve">, </w:t>
+      </w:r>
+      <w:r>
+        <w:rPr>
+          <w:rFonts w:ascii="JetBrains Mono" w:hAnsi="JetBrains Mono" w:eastAsia="JetBrains Mono" w:cs="JetBrains Mono"/>
+          <w:color w:val="0A5A3C"/>
+          <w:sz w:val="18"/>
+          <w:szCs w:val="18"/>
+        </w:rPr>
+        <w:t xml:space="preserve">SmartPot-DataGenerator</w:t>
+      </w:r>
+      <w:r>
+        <w:rPr>
+          <w:color w:val="17261F"/>
+          <w:sz w:val="20"/>
+          <w:szCs w:val="20"/>
+        </w:rPr>
+        <w:t xml:space="preserve"> y </w:t>
+      </w:r>
+      <w:r>
+        <w:rPr>
+          <w:rFonts w:ascii="JetBrains Mono" w:hAnsi="JetBrains Mono" w:eastAsia="JetBrains Mono" w:cs="JetBrains Mono"/>
+          <w:color w:val="0A5A3C"/>
+          <w:sz w:val="18"/>
+          <w:szCs w:val="18"/>
+        </w:rPr>
+        <w:t xml:space="preserve">SmartPot-API</w:t>
+      </w:r>
+      <w:r>
+        <w:rPr>
+          <w:color w:val="17261F"/>
+          <w:sz w:val="20"/>
+          <w:szCs w:val="20"/>
+        </w:rPr>
+        <w:t xml:space="preserve">: Dockerfiles reforzados con actualización de librerías del sistema operativo.</w:t>
       </w:r>
     </w:p>
     <w:p>
@@ -21241,7 +24490,7 @@
             <w:drawing>
               <wp:inline distT="0" distB="0" distL="0" distR="0">
                 <wp:extent cx="180000" cy="180000"/>
-                <wp:docPr id="122" name="Icono"/>
+                <wp:docPr id="125" name="Icono"/>
                 <wp:cNvGraphicFramePr>
                   <a:graphicFrameLocks noChangeAspect="1"/>
                 </wp:cNvGraphicFramePr>
@@ -21249,7 +24498,7 @@
                   <a:graphicData uri="http://schemas.openxmlformats.org/drawingml/2006/picture">
                     <pic:pic>
                       <pic:nvPicPr>
-                        <pic:cNvPr id="122" name="Icono"/>
+                        <pic:cNvPr id="125" name="Icono"/>
                         <pic:cNvPicPr/>
                       </pic:nvPicPr>
                       <pic:blipFill>

</xml_diff>